<commit_message>
Issue vs issuer ratings, sortable/filterable securities table, clickable notes
- securities.csv: issue_rating columns (LHV senior, Citadele SP: Moody's Baa2; AST bonds not rated)
- Cards and reports show issuer rating and per-issue rating separately
- Securities page: search, issuer/country/type/status filters, sortable columns
- Overview and card notes link to the relevant list; 'No new events' removed
- Maxima LLC namesake excluded from sanctions match

Co-Authored-By: Claude Opus 5.5 (1M context) <noreply@anthropic.com>
Claude-Session: https://claude.ai/code/session_013ZCssjCF43KM8LCnCdqfwt
</commit_message>
<xml_diff>
--- a/docs/files/aei/aei_6M2026_en.docx
+++ b/docs/files/aei/aei_6M2026_en.docx
@@ -175,7 +175,7 @@
                 <w:color w:val="5F6B7A"/>
                 <w:sz w:val="15"/>
               </w:rPr>
-              <w:t>Rating</w:t>
+              <w:t>Issuer rating</w:t>
             </w:r>
           </w:p>
           <w:p>
@@ -989,16 +989,17 @@
         <w:tblLook w:firstColumn="1" w:firstRow="1" w:lastColumn="0" w:lastRow="0" w:noHBand="0" w:noVBand="1" w:val="04A0"/>
       </w:tblPr>
       <w:tblGrid>
-        <w:gridCol w:w="1701"/>
-        <w:gridCol w:w="2608"/>
-        <w:gridCol w:w="963"/>
-        <w:gridCol w:w="1304"/>
-        <w:gridCol w:w="3061"/>
+        <w:gridCol w:w="1513"/>
+        <w:gridCol w:w="2241"/>
+        <w:gridCol w:w="840"/>
+        <w:gridCol w:w="1120"/>
+        <w:gridCol w:w="1569"/>
+        <w:gridCol w:w="2353"/>
       </w:tblGrid>
       <w:tr>
         <w:tc>
           <w:tcPr>
-            <w:tcW w:type="dxa" w:w="1701"/>
+            <w:tcW w:type="dxa" w:w="1513"/>
             <w:tcBorders>
               <w:top w:val="single" w:sz="12" w:color="1F4E79" w:space="0"/>
               <w:left w:val="nil"/>
@@ -1024,7 +1025,7 @@
         </w:tc>
         <w:tc>
           <w:tcPr>
-            <w:tcW w:type="dxa" w:w="2608"/>
+            <w:tcW w:type="dxa" w:w="2241"/>
             <w:tcBorders>
               <w:top w:val="single" w:sz="12" w:color="1F4E79" w:space="0"/>
               <w:left w:val="nil"/>
@@ -1050,7 +1051,7 @@
         </w:tc>
         <w:tc>
           <w:tcPr>
-            <w:tcW w:type="dxa" w:w="964"/>
+            <w:tcW w:type="dxa" w:w="841"/>
             <w:tcBorders>
               <w:top w:val="single" w:sz="12" w:color="1F4E79" w:space="0"/>
               <w:left w:val="nil"/>
@@ -1077,7 +1078,7 @@
         </w:tc>
         <w:tc>
           <w:tcPr>
-            <w:tcW w:type="dxa" w:w="1304"/>
+            <w:tcW w:type="dxa" w:w="1121"/>
             <w:tcBorders>
               <w:top w:val="single" w:sz="12" w:color="1F4E79" w:space="0"/>
               <w:left w:val="nil"/>
@@ -1103,7 +1104,33 @@
         </w:tc>
         <w:tc>
           <w:tcPr>
-            <w:tcW w:type="dxa" w:w="3061"/>
+            <w:tcW w:type="dxa" w:w="1569"/>
+            <w:tcBorders>
+              <w:top w:val="single" w:sz="12" w:color="1F4E79" w:space="0"/>
+              <w:left w:val="nil"/>
+              <w:bottom w:val="single" w:sz="4" w:color="C9D3DE" w:space="0"/>
+              <w:right w:val="nil"/>
+            </w:tcBorders>
+            <w:shd w:val="clear" w:color="auto" w:fill="EAF1F8"/>
+          </w:tcPr>
+          <w:p>
+            <w:pPr>
+              <w:spacing w:before="0" w:after="0"/>
+            </w:pPr>
+            <w:r>
+              <w:rPr>
+                <w:b/>
+                <w:caps/>
+                <w:color w:val="1F4E79"/>
+                <w:sz w:val="16"/>
+              </w:rPr>
+              <w:t>Issue rating</w:t>
+            </w:r>
+          </w:p>
+        </w:tc>
+        <w:tc>
+          <w:tcPr>
+            <w:tcW w:type="dxa" w:w="2353"/>
             <w:tcBorders>
               <w:top w:val="single" w:sz="12" w:color="1F4E79" w:space="0"/>
               <w:left w:val="nil"/>
@@ -1131,7 +1158,7 @@
       <w:tr>
         <w:tc>
           <w:tcPr>
-            <w:tcW w:type="dxa" w:w="1701"/>
+            <w:tcW w:type="dxa" w:w="1513"/>
             <w:tcBorders>
               <w:top w:val="nil"/>
               <w:left w:val="nil"/>
@@ -1154,7 +1181,7 @@
         </w:tc>
         <w:tc>
           <w:tcPr>
-            <w:tcW w:type="dxa" w:w="2608"/>
+            <w:tcW w:type="dxa" w:w="2241"/>
             <w:tcBorders>
               <w:top w:val="nil"/>
               <w:left w:val="nil"/>
@@ -1177,7 +1204,7 @@
         </w:tc>
         <w:tc>
           <w:tcPr>
-            <w:tcW w:type="dxa" w:w="964"/>
+            <w:tcW w:type="dxa" w:w="841"/>
             <w:tcBorders>
               <w:top w:val="nil"/>
               <w:left w:val="nil"/>
@@ -1201,7 +1228,7 @@
         </w:tc>
         <w:tc>
           <w:tcPr>
-            <w:tcW w:type="dxa" w:w="1304"/>
+            <w:tcW w:type="dxa" w:w="1121"/>
             <w:tcBorders>
               <w:top w:val="nil"/>
               <w:left w:val="nil"/>
@@ -1224,7 +1251,30 @@
         </w:tc>
         <w:tc>
           <w:tcPr>
-            <w:tcW w:type="dxa" w:w="3061"/>
+            <w:tcW w:type="dxa" w:w="1569"/>
+            <w:tcBorders>
+              <w:top w:val="nil"/>
+              <w:left w:val="nil"/>
+              <w:bottom w:val="single" w:sz="4" w:color="DDE3EA" w:space="0"/>
+              <w:right w:val="nil"/>
+            </w:tcBorders>
+          </w:tcPr>
+          <w:p>
+            <w:pPr>
+              <w:spacing w:before="0" w:after="0"/>
+            </w:pPr>
+            <w:r>
+              <w:rPr>
+                <w:b w:val="0"/>
+                <w:sz w:val="17"/>
+              </w:rPr>
+              <w:t>no separate rating found</w:t>
+            </w:r>
+          </w:p>
+        </w:tc>
+        <w:tc>
+          <w:tcPr>
+            <w:tcW w:type="dxa" w:w="2353"/>
             <w:tcBorders>
               <w:top w:val="nil"/>
               <w:left w:val="nil"/>

</xml_diff>

<commit_message>
Premium report design (Inter, first-page summary with sidebar, page X/Y), market context sections, bond quotes fetcher
Co-Authored-By: Claude Opus 5.5 (1M context) <noreply@anthropic.com>
Claude-Session: https://claude.ai/code/session_013ZCssjCF43KM8LCnCdqfwt
</commit_message>
<xml_diff>
--- a/docs/files/aei/aei_6M2026_en.docx
+++ b/docs/files/aei/aei_6M2026_en.docx
@@ -2,6 +2,14 @@
 <file path=word/document.xml><?xml version="1.0" encoding="utf-8"?>
 <w:document xmlns:wpc="http://schemas.microsoft.com/office/word/2010/wordprocessingCanvas" xmlns:mo="http://schemas.microsoft.com/office/mac/office/2008/main" xmlns:mc="http://schemas.openxmlformats.org/markup-compatibility/2006" xmlns:mv="urn:schemas-microsoft-com:mac:vml" xmlns:o="urn:schemas-microsoft-com:office:office" xmlns:r="http://schemas.openxmlformats.org/officeDocument/2006/relationships" xmlns:m="http://schemas.openxmlformats.org/officeDocument/2006/math" xmlns:v="urn:schemas-microsoft-com:vml" xmlns:wp14="http://schemas.microsoft.com/office/word/2010/wordprocessingDrawing" xmlns:wp="http://schemas.openxmlformats.org/drawingml/2006/wordprocessingDrawing" xmlns:w10="urn:schemas-microsoft-com:office:word" xmlns:w="http://schemas.openxmlformats.org/wordprocessingml/2006/main" xmlns:w14="http://schemas.microsoft.com/office/word/2010/wordml" xmlns:wpg="http://schemas.microsoft.com/office/word/2010/wordprocessingGroup" xmlns:wpi="http://schemas.microsoft.com/office/word/2010/wordprocessingInk" xmlns:wne="http://schemas.microsoft.com/office/word/2006/wordml" xmlns:wps="http://schemas.microsoft.com/office/word/2010/wordprocessingShape" mc:Ignorable="w14 wp14">
   <w:body>
+    <w:p>
+      <w:pPr>
+        <w:pBdr>
+          <w:top w:val="single" w:sz="24" w:color="12355B" w:space="0"/>
+        </w:pBdr>
+        <w:spacing w:before="0" w:after="200" w:line="120" w:lineRule="auto"/>
+      </w:pPr>
+    </w:p>
     <w:tbl>
       <w:tblPr>
         <w:tblW w:w="9639" w:type="dxa"/>
@@ -15,10 +23,10 @@
         </w:tblBorders>
         <w:tblLayout w:type="fixed"/>
         <w:tblCellMar>
-          <w:top w:w="260" w:type="dxa"/>
-          <w:left w:w="280" w:type="dxa"/>
-          <w:bottom w:w="260" w:type="dxa"/>
-          <w:right w:w="280" w:type="dxa"/>
+          <w:top w:w="0" w:type="dxa"/>
+          <w:left w:w="0" w:type="dxa"/>
+          <w:bottom w:w="0" w:type="dxa"/>
+          <w:right w:w="0" w:type="dxa"/>
         </w:tblCellMar>
         <w:tblLook w:firstColumn="1" w:firstRow="1" w:lastColumn="0" w:lastRow="0" w:noHBand="0" w:noVBand="1" w:val="04A0"/>
       </w:tblPr>
@@ -30,7 +38,6 @@
         <w:tc>
           <w:tcPr>
             <w:tcW w:type="dxa" w:w="7030"/>
-            <w:shd w:val="clear" w:color="auto" w:fill="1F4E79"/>
           </w:tcPr>
           <w:p>
             <w:pPr>
@@ -40,8 +47,8 @@
               <w:rPr>
                 <w:b/>
                 <w:caps/>
-                <w:color w:val="AFC6DD"/>
-                <w:sz w:val="17"/>
+                <w:color w:val="2A78D6"/>
+                <w:sz w:val="16"/>
               </w:rPr>
               <w:t>Issuer review · 6M2026</w:t>
             </w:r>
@@ -53,28 +60,40 @@
             <w:r>
               <w:rPr>
                 <w:b/>
-                <w:color w:val="FFFFFF"/>
+                <w:color w:val="12355B"/>
                 <w:sz w:val="40"/>
               </w:rPr>
               <w:t>Atsinaujinančios energetikos investicijos (AEI)</w:t>
+            </w:r>
+          </w:p>
+          <w:p>
+            <w:pPr>
+              <w:spacing w:before="40" w:after="0"/>
+            </w:pPr>
+            <w:r>
+              <w:rPr>
+                <w:b w:val="0"/>
+                <w:color w:val="667085"/>
+                <w:sz w:val="18"/>
+              </w:rPr>
+              <w:t>Lithuania · Closed-end renewable energy investment fund (solar, wind, BESS in LT, LV, PL)</w:t>
             </w:r>
           </w:p>
         </w:tc>
         <w:tc>
           <w:tcPr>
             <w:tcW w:type="dxa" w:w="2608"/>
-            <w:shd w:val="clear" w:color="auto" w:fill="1F4E79"/>
           </w:tcPr>
           <w:p>
             <w:pPr>
-              <w:spacing w:before="280" w:after="0"/>
+              <w:spacing w:before="440" w:after="0"/>
               <w:jc w:val="right"/>
             </w:pPr>
             <w:r>
               <w:rPr>
                 <w:b/>
                 <w:color w:val="9A6400"/>
-                <w:sz w:val="19"/>
+                <w:sz w:val="18"/>
                 <w:shd w:val="clear" w:color="auto" w:fill="FDF1D8"/>
               </w:rPr>
               <w:t xml:space="preserve">  ●  WATCH  </w:t>
@@ -86,9 +105,9 @@
     <w:p>
       <w:pPr>
         <w:pBdr>
-          <w:top w:val="single" w:sz="12" w:color="2A78D6" w:space="0"/>
+          <w:top w:val="single" w:sz="4" w:color="D5DCE4" w:space="0"/>
         </w:pBdr>
-        <w:spacing w:before="0" w:after="200" w:line="120" w:lineRule="auto"/>
+        <w:spacing w:before="120" w:after="200" w:line="120" w:lineRule="auto"/>
       </w:pPr>
     </w:p>
     <w:tbl>
@@ -104,39 +123,78 @@
         </w:tblBorders>
         <w:tblLayout w:type="fixed"/>
         <w:tblCellMar>
-          <w:top w:w="0" w:type="dxa"/>
-          <w:left w:w="0" w:type="dxa"/>
-          <w:bottom w:w="120" w:type="dxa"/>
-          <w:right w:w="160" w:type="dxa"/>
+          <w:top w:w="160" w:type="dxa"/>
+          <w:left w:w="220" w:type="dxa"/>
+          <w:bottom w:w="160" w:type="dxa"/>
+          <w:right w:w="220" w:type="dxa"/>
         </w:tblCellMar>
         <w:tblLook w:firstColumn="1" w:firstRow="1" w:lastColumn="0" w:lastRow="0" w:noHBand="0" w:noVBand="1" w:val="04A0"/>
       </w:tblPr>
       <w:tblGrid>
-        <w:gridCol w:w="3213"/>
-        <w:gridCol w:w="3213"/>
-        <w:gridCol w:w="3213"/>
+        <w:gridCol w:w="4819"/>
+        <w:gridCol w:w="4819"/>
       </w:tblGrid>
       <w:tr>
         <w:tc>
           <w:tcPr>
-            <w:tcW w:type="dxa" w:w="3213"/>
+            <w:tcW w:type="dxa" w:w="4819"/>
             <w:tcBorders>
-              <w:top w:val="nil"/>
+              <w:top w:val="single" w:sz="12" w:color="12355B" w:space="0"/>
               <w:left w:val="nil"/>
-              <w:bottom w:val="single" w:sz="4" w:color="C9D3DE" w:space="0"/>
+              <w:bottom w:val="nil"/>
               <w:right w:val="nil"/>
             </w:tcBorders>
+            <w:shd w:val="clear" w:color="auto" w:fill="F4F6F9"/>
           </w:tcPr>
           <w:p>
             <w:pPr>
-              <w:spacing w:before="0" w:after="20"/>
+              <w:spacing w:before="0" w:after="40"/>
+            </w:pPr>
+            <w:r>
+              <w:rPr>
+                <w:b/>
+                <w:color w:val="12355B"/>
+                <w:sz w:val="18"/>
+              </w:rPr>
+              <w:t>Key facts</w:t>
+            </w:r>
+          </w:p>
+          <w:p>
+            <w:pPr>
+              <w:spacing w:before="80" w:after="0"/>
             </w:pPr>
             <w:r>
               <w:rPr>
                 <w:b/>
                 <w:caps/>
-                <w:color w:val="5F6B7A"/>
-                <w:sz w:val="15"/>
+                <w:color w:val="667085"/>
+                <w:sz w:val="14"/>
+              </w:rPr>
+              <w:t>Issuer rating</w:t>
+            </w:r>
+          </w:p>
+          <w:p>
+            <w:pPr>
+              <w:spacing w:before="0" w:after="0"/>
+            </w:pPr>
+            <w:r>
+              <w:rPr>
+                <w:b w:val="0"/>
+                <w:sz w:val="18"/>
+              </w:rPr>
+              <w:t>nerasta (no credit rating found in the reports)</w:t>
+            </w:r>
+          </w:p>
+          <w:p>
+            <w:pPr>
+              <w:spacing w:before="80" w:after="0"/>
+            </w:pPr>
+            <w:r>
+              <w:rPr>
+                <w:b/>
+                <w:caps/>
+                <w:color w:val="667085"/>
+                <w:sz w:val="14"/>
               </w:rPr>
               <w:t>Analysis date</w:t>
             </w:r>
@@ -148,69 +206,21 @@
             <w:r>
               <w:rPr>
                 <w:b w:val="0"/>
-                <w:sz w:val="19"/>
+                <w:sz w:val="18"/>
               </w:rPr>
               <w:t>2026-10-22</w:t>
             </w:r>
           </w:p>
-        </w:tc>
-        <w:tc>
-          <w:tcPr>
-            <w:tcW w:type="dxa" w:w="3213"/>
-            <w:tcBorders>
-              <w:top w:val="nil"/>
-              <w:left w:val="nil"/>
-              <w:bottom w:val="single" w:sz="4" w:color="C9D3DE" w:space="0"/>
-              <w:right w:val="nil"/>
-            </w:tcBorders>
-          </w:tcPr>
           <w:p>
             <w:pPr>
-              <w:spacing w:before="0" w:after="20"/>
+              <w:spacing w:before="80" w:after="0"/>
             </w:pPr>
             <w:r>
               <w:rPr>
                 <w:b/>
                 <w:caps/>
-                <w:color w:val="5F6B7A"/>
-                <w:sz w:val="15"/>
-              </w:rPr>
-              <w:t>Issuer rating</w:t>
-            </w:r>
-          </w:p>
-          <w:p>
-            <w:pPr>
-              <w:spacing w:before="0" w:after="0"/>
-            </w:pPr>
-            <w:r>
-              <w:rPr>
-                <w:b w:val="0"/>
-                <w:sz w:val="19"/>
-              </w:rPr>
-              <w:t>nerasta (no credit rating found in the reports)</w:t>
-            </w:r>
-          </w:p>
-        </w:tc>
-        <w:tc>
-          <w:tcPr>
-            <w:tcW w:type="dxa" w:w="3213"/>
-            <w:tcBorders>
-              <w:top w:val="nil"/>
-              <w:left w:val="nil"/>
-              <w:bottom w:val="single" w:sz="4" w:color="C9D3DE" w:space="0"/>
-              <w:right w:val="nil"/>
-            </w:tcBorders>
-          </w:tcPr>
-          <w:p>
-            <w:pPr>
-              <w:spacing w:before="0" w:after="20"/>
-            </w:pPr>
-            <w:r>
-              <w:rPr>
-                <w:b/>
-                <w:caps/>
-                <w:color w:val="5F6B7A"/>
-                <w:sz w:val="15"/>
+                <w:color w:val="667085"/>
+                <w:sz w:val="14"/>
               </w:rPr>
               <w:t>Next report</w:t>
             </w:r>
@@ -222,9 +232,99 @@
             <w:r>
               <w:rPr>
                 <w:b w:val="0"/>
-                <w:sz w:val="19"/>
+                <w:sz w:val="18"/>
               </w:rPr>
               <w:t>9M 2026 interim report - expected November 2026</w:t>
+            </w:r>
+          </w:p>
+          <w:p>
+            <w:pPr>
+              <w:spacing w:before="80" w:after="0"/>
+            </w:pPr>
+            <w:r>
+              <w:rPr>
+                <w:b/>
+                <w:caps/>
+                <w:color w:val="667085"/>
+                <w:sz w:val="14"/>
+              </w:rPr>
+              <w:t>Country</w:t>
+            </w:r>
+          </w:p>
+          <w:p>
+            <w:pPr>
+              <w:spacing w:before="0" w:after="0"/>
+            </w:pPr>
+            <w:r>
+              <w:rPr>
+                <w:b w:val="0"/>
+                <w:sz w:val="18"/>
+              </w:rPr>
+              <w:t>Lithuania</w:t>
+            </w:r>
+          </w:p>
+        </w:tc>
+        <w:tc>
+          <w:tcPr>
+            <w:tcW w:type="dxa" w:w="4819"/>
+            <w:tcBorders>
+              <w:top w:val="single" w:sz="12" w:color="12355B" w:space="0"/>
+              <w:left w:val="nil"/>
+              <w:bottom w:val="nil"/>
+              <w:right w:val="nil"/>
+            </w:tcBorders>
+            <w:shd w:val="clear" w:color="auto" w:fill="F4F6F9"/>
+          </w:tcPr>
+          <w:p>
+            <w:pPr>
+              <w:spacing w:before="0" w:after="40"/>
+            </w:pPr>
+            <w:r>
+              <w:rPr>
+                <w:b/>
+                <w:color w:val="12355B"/>
+                <w:sz w:val="18"/>
+              </w:rPr>
+              <w:t>Securities held</w:t>
+            </w:r>
+          </w:p>
+          <w:p>
+            <w:pPr>
+              <w:spacing w:before="80" w:after="0"/>
+            </w:pPr>
+            <w:r>
+              <w:rPr>
+                <w:b/>
+                <w:color w:val="1B2430"/>
+                <w:sz w:val="17"/>
+              </w:rPr>
+              <w:t>AEI 8.00% green bonds 2025/2027</w:t>
+            </w:r>
+          </w:p>
+          <w:p>
+            <w:pPr>
+              <w:spacing w:before="0" w:after="0"/>
+            </w:pPr>
+            <w:r>
+              <w:rPr>
+                <w:b w:val="0"/>
+                <w:color w:val="667085"/>
+                <w:sz w:val="15"/>
+              </w:rPr>
+              <w:t>LT0000134439  ·  8.0% · 2027-12-13</w:t>
+            </w:r>
+          </w:p>
+          <w:p>
+            <w:pPr>
+              <w:spacing w:before="0" w:after="0"/>
+            </w:pPr>
+            <w:r>
+              <w:rPr>
+                <w:b w:val="0"/>
+                <w:color w:val="12355B"/>
+                <w:sz w:val="15"/>
+              </w:rPr>
+              <w:t>no separate rating found</w:t>
             </w:r>
           </w:p>
         </w:tc>
@@ -232,7 +332,7 @@
     </w:tbl>
     <w:p>
       <w:pPr>
-        <w:spacing w:before="0" w:after="80"/>
+        <w:spacing w:before="0" w:after="120"/>
       </w:pPr>
     </w:p>
     <w:tbl>
@@ -277,7 +377,7 @@
             <w:r>
               <w:rPr>
                 <w:b/>
-                <w:color w:val="1A1A1A"/>
+                <w:color w:val="1B2430"/>
                 <w:sz w:val="21"/>
               </w:rPr>
               <w:t>Watch.</w:t>
@@ -285,7 +385,7 @@
             <w:r>
               <w:rPr>
                 <w:b w:val="0"/>
-                <w:color w:val="1A1A1A"/>
+                <w:color w:val="1B2430"/>
                 <w:sz w:val="21"/>
               </w:rPr>
               <w:t xml:space="preserve"> AEI itself states that current liabilities exceed current assets and EUR 24.7m of bonds must be repaid on 2026-12-04; it has started selling projects to raise funds</w:t>
@@ -303,7 +403,7 @@
             <w:r>
               <w:rPr>
                 <w:b w:val="0"/>
-                <w:color w:val="1A1A1A"/>
+                <w:color w:val="1B2430"/>
                 <w:sz w:val="21"/>
               </w:rPr>
               <w:t>. Covenants were met at 2026-06-30, with an equity ratio of 54.5% (floor 50%)</w:t>
@@ -321,7 +421,7 @@
             <w:r>
               <w:rPr>
                 <w:b w:val="0"/>
-                <w:color w:val="1A1A1A"/>
+                <w:color w:val="1B2430"/>
                 <w:sz w:val="21"/>
               </w:rPr>
               <w:t>.</w:t>
@@ -370,9 +470,9 @@
             <w:tcW w:type="dxa" w:w="2261"/>
             <w:tcBorders>
               <w:top w:val="single" w:sz="18" w:color="2A78D6" w:space="0"/>
-              <w:left w:val="single" w:sz="4" w:color="C9D3DE" w:space="0"/>
-              <w:bottom w:val="single" w:sz="4" w:color="C9D3DE" w:space="0"/>
-              <w:right w:val="single" w:sz="4" w:color="C9D3DE" w:space="0"/>
+              <w:left w:val="single" w:sz="4" w:color="D5DCE4" w:space="0"/>
+              <w:bottom w:val="single" w:sz="4" w:color="D5DCE4" w:space="0"/>
+              <w:right w:val="single" w:sz="4" w:color="D5DCE4" w:space="0"/>
             </w:tcBorders>
           </w:tcPr>
           <w:p>
@@ -383,7 +483,7 @@
               <w:rPr>
                 <w:b/>
                 <w:caps/>
-                <w:color w:val="5F6B7A"/>
+                <w:color w:val="667085"/>
                 <w:sz w:val="14"/>
               </w:rPr>
               <w:t>Net profit</w:t>
@@ -391,7 +491,7 @@
             <w:r>
               <w:rPr>
                 <w:b w:val="0"/>
-                <w:color w:val="5F6B7A"/>
+                <w:color w:val="667085"/>
                 <w:sz w:val="14"/>
               </w:rPr>
               <w:t xml:space="preserve">  ·  6M2026</w:t>
@@ -404,7 +504,7 @@
             <w:r>
               <w:rPr>
                 <w:b/>
-                <w:color w:val="1F4E79"/>
+                <w:color w:val="12355B"/>
                 <w:sz w:val="34"/>
               </w:rPr>
               <w:t>-5.13</w:t>
@@ -412,7 +512,7 @@
             <w:r>
               <w:rPr>
                 <w:b w:val="0"/>
-                <w:color w:val="5F6B7A"/>
+                <w:color w:val="667085"/>
                 <w:sz w:val="18"/>
               </w:rPr>
               <w:t xml:space="preserve"> EUR m</w:t>
@@ -425,7 +525,7 @@
             <w:r>
               <w:rPr>
                 <w:b w:val="0"/>
-                <w:color w:val="5F6B7A"/>
+                <w:color w:val="667085"/>
                 <w:sz w:val="15"/>
               </w:rPr>
               <w:t>▼ 26.4 % vs 6M2025</w:t>
@@ -443,9 +543,9 @@
             <w:tcW w:type="dxa" w:w="2261"/>
             <w:tcBorders>
               <w:top w:val="single" w:sz="18" w:color="2A78D6" w:space="0"/>
-              <w:left w:val="single" w:sz="4" w:color="C9D3DE" w:space="0"/>
-              <w:bottom w:val="single" w:sz="4" w:color="C9D3DE" w:space="0"/>
-              <w:right w:val="single" w:sz="4" w:color="C9D3DE" w:space="0"/>
+              <w:left w:val="single" w:sz="4" w:color="D5DCE4" w:space="0"/>
+              <w:bottom w:val="single" w:sz="4" w:color="D5DCE4" w:space="0"/>
+              <w:right w:val="single" w:sz="4" w:color="D5DCE4" w:space="0"/>
             </w:tcBorders>
           </w:tcPr>
           <w:p>
@@ -456,7 +556,7 @@
               <w:rPr>
                 <w:b/>
                 <w:caps/>
-                <w:color w:val="5F6B7A"/>
+                <w:color w:val="667085"/>
                 <w:sz w:val="14"/>
               </w:rPr>
               <w:t>Equity ratio</w:t>
@@ -464,7 +564,7 @@
             <w:r>
               <w:rPr>
                 <w:b w:val="0"/>
-                <w:color w:val="5F6B7A"/>
+                <w:color w:val="667085"/>
                 <w:sz w:val="14"/>
               </w:rPr>
               <w:t xml:space="preserve">  ·  6M2026</w:t>
@@ -477,7 +577,7 @@
             <w:r>
               <w:rPr>
                 <w:b/>
-                <w:color w:val="1F4E79"/>
+                <w:color w:val="12355B"/>
                 <w:sz w:val="34"/>
               </w:rPr>
               <w:t>54.5</w:t>
@@ -485,7 +585,7 @@
             <w:r>
               <w:rPr>
                 <w:b w:val="0"/>
-                <w:color w:val="5F6B7A"/>
+                <w:color w:val="667085"/>
                 <w:sz w:val="18"/>
               </w:rPr>
               <w:t xml:space="preserve"> %</w:t>
@@ -498,7 +598,7 @@
             <w:r>
               <w:rPr>
                 <w:b w:val="0"/>
-                <w:color w:val="5F6B7A"/>
+                <w:color w:val="667085"/>
                 <w:sz w:val="15"/>
               </w:rPr>
               <w:t>▲ 3.7 p. p. vs FY2025</w:t>
@@ -516,9 +616,9 @@
             <w:tcW w:type="dxa" w:w="2261"/>
             <w:tcBorders>
               <w:top w:val="single" w:sz="18" w:color="2A78D6" w:space="0"/>
-              <w:left w:val="single" w:sz="4" w:color="C9D3DE" w:space="0"/>
-              <w:bottom w:val="single" w:sz="4" w:color="C9D3DE" w:space="0"/>
-              <w:right w:val="single" w:sz="4" w:color="C9D3DE" w:space="0"/>
+              <w:left w:val="single" w:sz="4" w:color="D5DCE4" w:space="0"/>
+              <w:bottom w:val="single" w:sz="4" w:color="D5DCE4" w:space="0"/>
+              <w:right w:val="single" w:sz="4" w:color="D5DCE4" w:space="0"/>
             </w:tcBorders>
           </w:tcPr>
           <w:p>
@@ -529,7 +629,7 @@
               <w:rPr>
                 <w:b/>
                 <w:caps/>
-                <w:color w:val="5F6B7A"/>
+                <w:color w:val="667085"/>
                 <w:sz w:val="14"/>
               </w:rPr>
               <w:t>Net debt</w:t>
@@ -537,7 +637,7 @@
             <w:r>
               <w:rPr>
                 <w:b w:val="0"/>
-                <w:color w:val="5F6B7A"/>
+                <w:color w:val="667085"/>
                 <w:sz w:val="14"/>
               </w:rPr>
               <w:t xml:space="preserve">  ·  6M2026</w:t>
@@ -550,7 +650,7 @@
             <w:r>
               <w:rPr>
                 <w:b/>
-                <w:color w:val="1F4E79"/>
+                <w:color w:val="12355B"/>
                 <w:sz w:val="34"/>
               </w:rPr>
               <w:t>63.5</w:t>
@@ -558,7 +658,7 @@
             <w:r>
               <w:rPr>
                 <w:b w:val="0"/>
-                <w:color w:val="5F6B7A"/>
+                <w:color w:val="667085"/>
                 <w:sz w:val="18"/>
               </w:rPr>
               <w:t xml:space="preserve"> EUR m</w:t>
@@ -571,7 +671,7 @@
             <w:r>
               <w:rPr>
                 <w:b w:val="0"/>
-                <w:color w:val="5F6B7A"/>
+                <w:color w:val="667085"/>
                 <w:sz w:val="15"/>
               </w:rPr>
               <w:t>▼ 16.6 % vs FY2025</w:t>
@@ -589,9 +689,9 @@
             <w:tcW w:type="dxa" w:w="2261"/>
             <w:tcBorders>
               <w:top w:val="single" w:sz="18" w:color="2A78D6" w:space="0"/>
-              <w:left w:val="single" w:sz="4" w:color="C9D3DE" w:space="0"/>
-              <w:bottom w:val="single" w:sz="4" w:color="C9D3DE" w:space="0"/>
-              <w:right w:val="single" w:sz="4" w:color="C9D3DE" w:space="0"/>
+              <w:left w:val="single" w:sz="4" w:color="D5DCE4" w:space="0"/>
+              <w:bottom w:val="single" w:sz="4" w:color="D5DCE4" w:space="0"/>
+              <w:right w:val="single" w:sz="4" w:color="D5DCE4" w:space="0"/>
             </w:tcBorders>
           </w:tcPr>
           <w:p>
@@ -602,7 +702,7 @@
               <w:rPr>
                 <w:b/>
                 <w:caps/>
-                <w:color w:val="5F6B7A"/>
+                <w:color w:val="667085"/>
                 <w:sz w:val="14"/>
               </w:rPr>
               <w:t>Installed green capacity</w:t>
@@ -610,7 +710,7 @@
             <w:r>
               <w:rPr>
                 <w:b w:val="0"/>
-                <w:color w:val="5F6B7A"/>
+                <w:color w:val="667085"/>
                 <w:sz w:val="14"/>
               </w:rPr>
               <w:t xml:space="preserve">  ·  6M2026</w:t>
@@ -623,7 +723,7 @@
             <w:r>
               <w:rPr>
                 <w:b/>
-                <w:color w:val="1F4E79"/>
+                <w:color w:val="12355B"/>
                 <w:sz w:val="34"/>
               </w:rPr>
               <w:t>317.9</w:t>
@@ -631,7 +731,7 @@
             <w:r>
               <w:rPr>
                 <w:b w:val="0"/>
-                <w:color w:val="5F6B7A"/>
+                <w:color w:val="667085"/>
                 <w:sz w:val="18"/>
               </w:rPr>
               <w:t xml:space="preserve"> MW</w:t>
@@ -644,7 +744,7 @@
             <w:r>
               <w:rPr>
                 <w:b w:val="0"/>
-                <w:color w:val="5F6B7A"/>
+                <w:color w:val="667085"/>
                 <w:sz w:val="15"/>
               </w:rPr>
               <w:t xml:space="preserve"> </w:t>
@@ -661,28 +761,13 @@
     <w:p>
       <w:pPr>
         <w:keepNext/>
-        <w:pBdr>
-          <w:bottom w:val="single" w:sz="8" w:color="1F4E79" w:space="4"/>
-        </w:pBdr>
-        <w:tabs>
-          <w:tab w:pos="482" w:val="left"/>
-        </w:tabs>
-        <w:spacing w:before="360" w:after="160"/>
+        <w:spacing w:before="200" w:after="100"/>
       </w:pPr>
       <w:r>
         <w:rPr>
           <w:b/>
-          <w:color w:val="2A78D6"/>
-          <w:sz w:val="18"/>
-        </w:rPr>
-        <w:t>01</w:t>
-        <w:tab/>
-      </w:r>
-      <w:r>
-        <w:rPr>
-          <w:b/>
-          <w:color w:val="1F4E79"/>
-          <w:sz w:val="28"/>
+          <w:color w:val="12355B"/>
+          <w:sz w:val="26"/>
         </w:rPr>
         <w:t>Quick summary</w:t>
       </w:r>
@@ -943,7 +1028,7 @@
       <w:pPr>
         <w:keepNext/>
         <w:pBdr>
-          <w:bottom w:val="single" w:sz="8" w:color="1F4E79" w:space="4"/>
+          <w:bottom w:val="single" w:sz="8" w:color="12355B" w:space="4"/>
         </w:pBdr>
         <w:tabs>
           <w:tab w:pos="482" w:val="left"/>
@@ -956,13 +1041,13 @@
           <w:color w:val="2A78D6"/>
           <w:sz w:val="18"/>
         </w:rPr>
-        <w:t>02</w:t>
+        <w:t>01</w:t>
         <w:tab/>
       </w:r>
       <w:r>
         <w:rPr>
           <w:b/>
-          <w:color w:val="1F4E79"/>
+          <w:color w:val="12355B"/>
           <w:sz w:val="28"/>
         </w:rPr>
         <w:t>Instruments held and ISINs</w:t>
@@ -989,24 +1074,23 @@
         <w:tblLook w:firstColumn="1" w:firstRow="1" w:lastColumn="0" w:lastRow="0" w:noHBand="0" w:noVBand="1" w:val="04A0"/>
       </w:tblPr>
       <w:tblGrid>
-        <w:gridCol w:w="1513"/>
+        <w:gridCol w:w="1457"/>
         <w:gridCol w:w="2241"/>
-        <w:gridCol w:w="840"/>
+        <w:gridCol w:w="1064"/>
         <w:gridCol w:w="1120"/>
         <w:gridCol w:w="1569"/>
-        <w:gridCol w:w="2353"/>
+        <w:gridCol w:w="2185"/>
       </w:tblGrid>
       <w:tr>
         <w:tc>
           <w:tcPr>
-            <w:tcW w:type="dxa" w:w="1513"/>
+            <w:tcW w:type="dxa" w:w="1457"/>
             <w:tcBorders>
-              <w:top w:val="single" w:sz="12" w:color="1F4E79" w:space="0"/>
+              <w:top w:val="nil"/>
               <w:left w:val="nil"/>
-              <w:bottom w:val="single" w:sz="4" w:color="C9D3DE" w:space="0"/>
+              <w:bottom w:val="single" w:sz="8" w:color="12355B" w:space="0"/>
               <w:right w:val="nil"/>
             </w:tcBorders>
-            <w:shd w:val="clear" w:color="auto" w:fill="EAF1F8"/>
           </w:tcPr>
           <w:p>
             <w:pPr>
@@ -1016,8 +1100,8 @@
               <w:rPr>
                 <w:b/>
                 <w:caps/>
-                <w:color w:val="1F4E79"/>
-                <w:sz w:val="16"/>
+                <w:color w:val="667085"/>
+                <w:sz w:val="14"/>
               </w:rPr>
               <w:t>ISIN</w:t>
             </w:r>
@@ -1027,12 +1111,11 @@
           <w:tcPr>
             <w:tcW w:type="dxa" w:w="2241"/>
             <w:tcBorders>
-              <w:top w:val="single" w:sz="12" w:color="1F4E79" w:space="0"/>
+              <w:top w:val="nil"/>
               <w:left w:val="nil"/>
-              <w:bottom w:val="single" w:sz="4" w:color="C9D3DE" w:space="0"/>
+              <w:bottom w:val="single" w:sz="8" w:color="12355B" w:space="0"/>
               <w:right w:val="nil"/>
             </w:tcBorders>
-            <w:shd w:val="clear" w:color="auto" w:fill="EAF1F8"/>
           </w:tcPr>
           <w:p>
             <w:pPr>
@@ -1042,8 +1125,8 @@
               <w:rPr>
                 <w:b/>
                 <w:caps/>
-                <w:color w:val="1F4E79"/>
-                <w:sz w:val="16"/>
+                <w:color w:val="667085"/>
+                <w:sz w:val="14"/>
               </w:rPr>
               <w:t>Instrument</w:t>
             </w:r>
@@ -1051,14 +1134,13 @@
         </w:tc>
         <w:tc>
           <w:tcPr>
-            <w:tcW w:type="dxa" w:w="841"/>
+            <w:tcW w:type="dxa" w:w="1065"/>
             <w:tcBorders>
-              <w:top w:val="single" w:sz="12" w:color="1F4E79" w:space="0"/>
+              <w:top w:val="nil"/>
               <w:left w:val="nil"/>
-              <w:bottom w:val="single" w:sz="4" w:color="C9D3DE" w:space="0"/>
+              <w:bottom w:val="single" w:sz="8" w:color="12355B" w:space="0"/>
               <w:right w:val="nil"/>
             </w:tcBorders>
-            <w:shd w:val="clear" w:color="auto" w:fill="EAF1F8"/>
           </w:tcPr>
           <w:p>
             <w:pPr>
@@ -1069,8 +1151,8 @@
               <w:rPr>
                 <w:b/>
                 <w:caps/>
-                <w:color w:val="1F4E79"/>
-                <w:sz w:val="16"/>
+                <w:color w:val="667085"/>
+                <w:sz w:val="14"/>
               </w:rPr>
               <w:t>Coupon</w:t>
             </w:r>
@@ -1080,12 +1162,11 @@
           <w:tcPr>
             <w:tcW w:type="dxa" w:w="1121"/>
             <w:tcBorders>
-              <w:top w:val="single" w:sz="12" w:color="1F4E79" w:space="0"/>
+              <w:top w:val="nil"/>
               <w:left w:val="nil"/>
-              <w:bottom w:val="single" w:sz="4" w:color="C9D3DE" w:space="0"/>
+              <w:bottom w:val="single" w:sz="8" w:color="12355B" w:space="0"/>
               <w:right w:val="nil"/>
             </w:tcBorders>
-            <w:shd w:val="clear" w:color="auto" w:fill="EAF1F8"/>
           </w:tcPr>
           <w:p>
             <w:pPr>
@@ -1095,8 +1176,8 @@
               <w:rPr>
                 <w:b/>
                 <w:caps/>
-                <w:color w:val="1F4E79"/>
-                <w:sz w:val="16"/>
+                <w:color w:val="667085"/>
+                <w:sz w:val="14"/>
               </w:rPr>
               <w:t>Maturity</w:t>
             </w:r>
@@ -1106,12 +1187,11 @@
           <w:tcPr>
             <w:tcW w:type="dxa" w:w="1569"/>
             <w:tcBorders>
-              <w:top w:val="single" w:sz="12" w:color="1F4E79" w:space="0"/>
+              <w:top w:val="nil"/>
               <w:left w:val="nil"/>
-              <w:bottom w:val="single" w:sz="4" w:color="C9D3DE" w:space="0"/>
+              <w:bottom w:val="single" w:sz="8" w:color="12355B" w:space="0"/>
               <w:right w:val="nil"/>
             </w:tcBorders>
-            <w:shd w:val="clear" w:color="auto" w:fill="EAF1F8"/>
           </w:tcPr>
           <w:p>
             <w:pPr>
@@ -1121,8 +1201,8 @@
               <w:rPr>
                 <w:b/>
                 <w:caps/>
-                <w:color w:val="1F4E79"/>
-                <w:sz w:val="16"/>
+                <w:color w:val="667085"/>
+                <w:sz w:val="14"/>
               </w:rPr>
               <w:t>Issue rating</w:t>
             </w:r>
@@ -1130,14 +1210,13 @@
         </w:tc>
         <w:tc>
           <w:tcPr>
-            <w:tcW w:type="dxa" w:w="2353"/>
+            <w:tcW w:type="dxa" w:w="2185"/>
             <w:tcBorders>
-              <w:top w:val="single" w:sz="12" w:color="1F4E79" w:space="0"/>
+              <w:top w:val="nil"/>
               <w:left w:val="nil"/>
-              <w:bottom w:val="single" w:sz="4" w:color="C9D3DE" w:space="0"/>
+              <w:bottom w:val="single" w:sz="8" w:color="12355B" w:space="0"/>
               <w:right w:val="nil"/>
             </w:tcBorders>
-            <w:shd w:val="clear" w:color="auto" w:fill="EAF1F8"/>
           </w:tcPr>
           <w:p>
             <w:pPr>
@@ -1147,8 +1226,8 @@
               <w:rPr>
                 <w:b/>
                 <w:caps/>
-                <w:color w:val="1F4E79"/>
-                <w:sz w:val="16"/>
+                <w:color w:val="667085"/>
+                <w:sz w:val="14"/>
               </w:rPr>
               <w:t>Note</w:t>
             </w:r>
@@ -1158,11 +1237,11 @@
       <w:tr>
         <w:tc>
           <w:tcPr>
-            <w:tcW w:type="dxa" w:w="1513"/>
+            <w:tcW w:type="dxa" w:w="1457"/>
             <w:tcBorders>
               <w:top w:val="nil"/>
               <w:left w:val="nil"/>
-              <w:bottom w:val="single" w:sz="4" w:color="DDE3EA" w:space="0"/>
+              <w:bottom w:val="single" w:sz="4" w:color="E6EAF0" w:space="0"/>
               <w:right w:val="nil"/>
             </w:tcBorders>
           </w:tcPr>
@@ -1185,7 +1264,7 @@
             <w:tcBorders>
               <w:top w:val="nil"/>
               <w:left w:val="nil"/>
-              <w:bottom w:val="single" w:sz="4" w:color="DDE3EA" w:space="0"/>
+              <w:bottom w:val="single" w:sz="4" w:color="E6EAF0" w:space="0"/>
               <w:right w:val="nil"/>
             </w:tcBorders>
           </w:tcPr>
@@ -1204,11 +1283,11 @@
         </w:tc>
         <w:tc>
           <w:tcPr>
-            <w:tcW w:type="dxa" w:w="841"/>
+            <w:tcW w:type="dxa" w:w="1065"/>
             <w:tcBorders>
               <w:top w:val="nil"/>
               <w:left w:val="nil"/>
-              <w:bottom w:val="single" w:sz="4" w:color="DDE3EA" w:space="0"/>
+              <w:bottom w:val="single" w:sz="4" w:color="E6EAF0" w:space="0"/>
               <w:right w:val="nil"/>
             </w:tcBorders>
           </w:tcPr>
@@ -1232,7 +1311,7 @@
             <w:tcBorders>
               <w:top w:val="nil"/>
               <w:left w:val="nil"/>
-              <w:bottom w:val="single" w:sz="4" w:color="DDE3EA" w:space="0"/>
+              <w:bottom w:val="single" w:sz="4" w:color="E6EAF0" w:space="0"/>
               <w:right w:val="nil"/>
             </w:tcBorders>
           </w:tcPr>
@@ -1255,7 +1334,7 @@
             <w:tcBorders>
               <w:top w:val="nil"/>
               <w:left w:val="nil"/>
-              <w:bottom w:val="single" w:sz="4" w:color="DDE3EA" w:space="0"/>
+              <w:bottom w:val="single" w:sz="4" w:color="E6EAF0" w:space="0"/>
               <w:right w:val="nil"/>
             </w:tcBorders>
           </w:tcPr>
@@ -1274,11 +1353,11 @@
         </w:tc>
         <w:tc>
           <w:tcPr>
-            <w:tcW w:type="dxa" w:w="2353"/>
+            <w:tcW w:type="dxa" w:w="2185"/>
             <w:tcBorders>
               <w:top w:val="nil"/>
               <w:left w:val="nil"/>
-              <w:bottom w:val="single" w:sz="4" w:color="DDE3EA" w:space="0"/>
+              <w:bottom w:val="single" w:sz="4" w:color="E6EAF0" w:space="0"/>
               <w:right w:val="nil"/>
             </w:tcBorders>
           </w:tcPr>
@@ -1306,7 +1385,7 @@
       <w:pPr>
         <w:keepNext/>
         <w:pBdr>
-          <w:bottom w:val="single" w:sz="8" w:color="1F4E79" w:space="4"/>
+          <w:bottom w:val="single" w:sz="8" w:color="12355B" w:space="4"/>
         </w:pBdr>
         <w:tabs>
           <w:tab w:pos="482" w:val="left"/>
@@ -1319,13 +1398,13 @@
           <w:color w:val="2A78D6"/>
           <w:sz w:val="18"/>
         </w:rPr>
-        <w:t>03</w:t>
+        <w:t>02</w:t>
         <w:tab/>
       </w:r>
       <w:r>
         <w:rPr>
           <w:b/>
-          <w:color w:val="1F4E79"/>
+          <w:color w:val="12355B"/>
           <w:sz w:val="28"/>
         </w:rPr>
         <w:t>Key ratios</w:t>
@@ -1363,12 +1442,11 @@
           <w:tcPr>
             <w:tcW w:type="dxa" w:w="3254"/>
             <w:tcBorders>
-              <w:top w:val="single" w:sz="12" w:color="1F4E79" w:space="0"/>
+              <w:top w:val="nil"/>
               <w:left w:val="nil"/>
-              <w:bottom w:val="single" w:sz="4" w:color="C9D3DE" w:space="0"/>
+              <w:bottom w:val="single" w:sz="8" w:color="12355B" w:space="0"/>
               <w:right w:val="nil"/>
             </w:tcBorders>
-            <w:shd w:val="clear" w:color="auto" w:fill="EAF1F8"/>
           </w:tcPr>
           <w:p>
             <w:pPr>
@@ -1378,8 +1456,8 @@
               <w:rPr>
                 <w:b/>
                 <w:caps/>
-                <w:color w:val="1F4E79"/>
-                <w:sz w:val="16"/>
+                <w:color w:val="667085"/>
+                <w:sz w:val="14"/>
               </w:rPr>
               <w:t>Metric</w:t>
             </w:r>
@@ -1389,12 +1467,11 @@
           <w:tcPr>
             <w:tcW w:type="dxa" w:w="1314"/>
             <w:tcBorders>
-              <w:top w:val="single" w:sz="12" w:color="1F4E79" w:space="0"/>
+              <w:top w:val="nil"/>
               <w:left w:val="nil"/>
-              <w:bottom w:val="single" w:sz="4" w:color="C9D3DE" w:space="0"/>
+              <w:bottom w:val="single" w:sz="8" w:color="12355B" w:space="0"/>
               <w:right w:val="nil"/>
             </w:tcBorders>
-            <w:shd w:val="clear" w:color="auto" w:fill="EAF1F8"/>
           </w:tcPr>
           <w:p>
             <w:pPr>
@@ -1405,8 +1482,8 @@
               <w:rPr>
                 <w:b/>
                 <w:caps/>
-                <w:color w:val="1F4E79"/>
-                <w:sz w:val="16"/>
+                <w:color w:val="667085"/>
+                <w:sz w:val="14"/>
               </w:rPr>
               <w:t>FY2024</w:t>
             </w:r>
@@ -1416,12 +1493,11 @@
           <w:tcPr>
             <w:tcW w:type="dxa" w:w="1314"/>
             <w:tcBorders>
-              <w:top w:val="single" w:sz="12" w:color="1F4E79" w:space="0"/>
+              <w:top w:val="nil"/>
               <w:left w:val="nil"/>
-              <w:bottom w:val="single" w:sz="4" w:color="C9D3DE" w:space="0"/>
+              <w:bottom w:val="single" w:sz="8" w:color="12355B" w:space="0"/>
               <w:right w:val="nil"/>
             </w:tcBorders>
-            <w:shd w:val="clear" w:color="auto" w:fill="EAF1F8"/>
           </w:tcPr>
           <w:p>
             <w:pPr>
@@ -1432,8 +1508,8 @@
               <w:rPr>
                 <w:b/>
                 <w:caps/>
-                <w:color w:val="1F4E79"/>
-                <w:sz w:val="16"/>
+                <w:color w:val="667085"/>
+                <w:sz w:val="14"/>
               </w:rPr>
               <w:t>FY2025</w:t>
             </w:r>
@@ -1443,12 +1519,11 @@
           <w:tcPr>
             <w:tcW w:type="dxa" w:w="1314"/>
             <w:tcBorders>
-              <w:top w:val="single" w:sz="12" w:color="1F4E79" w:space="0"/>
+              <w:top w:val="nil"/>
               <w:left w:val="nil"/>
-              <w:bottom w:val="single" w:sz="4" w:color="C9D3DE" w:space="0"/>
+              <w:bottom w:val="single" w:sz="8" w:color="12355B" w:space="0"/>
               <w:right w:val="nil"/>
             </w:tcBorders>
-            <w:shd w:val="clear" w:color="auto" w:fill="EAF1F8"/>
           </w:tcPr>
           <w:p>
             <w:pPr>
@@ -1459,8 +1534,8 @@
               <w:rPr>
                 <w:b/>
                 <w:caps/>
-                <w:color w:val="1F4E79"/>
-                <w:sz w:val="16"/>
+                <w:color w:val="667085"/>
+                <w:sz w:val="14"/>
               </w:rPr>
               <w:t>6M2026</w:t>
             </w:r>
@@ -1470,12 +1545,11 @@
           <w:tcPr>
             <w:tcW w:type="dxa" w:w="2441"/>
             <w:tcBorders>
-              <w:top w:val="single" w:sz="12" w:color="1F4E79" w:space="0"/>
+              <w:top w:val="nil"/>
               <w:left w:val="nil"/>
-              <w:bottom w:val="single" w:sz="4" w:color="C9D3DE" w:space="0"/>
+              <w:bottom w:val="single" w:sz="8" w:color="12355B" w:space="0"/>
               <w:right w:val="nil"/>
             </w:tcBorders>
-            <w:shd w:val="clear" w:color="auto" w:fill="EAF1F8"/>
           </w:tcPr>
           <w:p>
             <w:pPr>
@@ -1486,8 +1560,8 @@
               <w:rPr>
                 <w:b/>
                 <w:caps/>
-                <w:color w:val="1F4E79"/>
-                <w:sz w:val="16"/>
+                <w:color w:val="667085"/>
+                <w:sz w:val="14"/>
               </w:rPr>
               <w:t>Change</w:t>
             </w:r>
@@ -1501,7 +1575,7 @@
             <w:tcBorders>
               <w:top w:val="nil"/>
               <w:left w:val="nil"/>
-              <w:bottom w:val="single" w:sz="4" w:color="DDE3EA" w:space="0"/>
+              <w:bottom w:val="single" w:sz="4" w:color="E6EAF0" w:space="0"/>
               <w:right w:val="nil"/>
             </w:tcBorders>
           </w:tcPr>
@@ -1551,7 +1625,7 @@
             <w:tcBorders>
               <w:top w:val="nil"/>
               <w:left w:val="nil"/>
-              <w:bottom w:val="single" w:sz="4" w:color="DDE3EA" w:space="0"/>
+              <w:bottom w:val="single" w:sz="4" w:color="E6EAF0" w:space="0"/>
               <w:right w:val="nil"/>
             </w:tcBorders>
           </w:tcPr>
@@ -1575,7 +1649,7 @@
             <w:tcBorders>
               <w:top w:val="nil"/>
               <w:left w:val="nil"/>
-              <w:bottom w:val="single" w:sz="4" w:color="DDE3EA" w:space="0"/>
+              <w:bottom w:val="single" w:sz="4" w:color="E6EAF0" w:space="0"/>
               <w:right w:val="nil"/>
             </w:tcBorders>
           </w:tcPr>
@@ -1599,7 +1673,7 @@
             <w:tcBorders>
               <w:top w:val="nil"/>
               <w:left w:val="nil"/>
-              <w:bottom w:val="single" w:sz="4" w:color="DDE3EA" w:space="0"/>
+              <w:bottom w:val="single" w:sz="4" w:color="E6EAF0" w:space="0"/>
               <w:right w:val="nil"/>
             </w:tcBorders>
           </w:tcPr>
@@ -1623,7 +1697,7 @@
             <w:tcBorders>
               <w:top w:val="nil"/>
               <w:left w:val="nil"/>
-              <w:bottom w:val="single" w:sz="4" w:color="DDE3EA" w:space="0"/>
+              <w:bottom w:val="single" w:sz="4" w:color="E6EAF0" w:space="0"/>
               <w:right w:val="nil"/>
             </w:tcBorders>
           </w:tcPr>
@@ -1650,7 +1724,7 @@
             <w:tcBorders>
               <w:top w:val="nil"/>
               <w:left w:val="nil"/>
-              <w:bottom w:val="single" w:sz="4" w:color="DDE3EA" w:space="0"/>
+              <w:bottom w:val="single" w:sz="4" w:color="E6EAF0" w:space="0"/>
               <w:right w:val="nil"/>
             </w:tcBorders>
           </w:tcPr>
@@ -1700,7 +1774,7 @@
             <w:tcBorders>
               <w:top w:val="nil"/>
               <w:left w:val="nil"/>
-              <w:bottom w:val="single" w:sz="4" w:color="DDE3EA" w:space="0"/>
+              <w:bottom w:val="single" w:sz="4" w:color="E6EAF0" w:space="0"/>
               <w:right w:val="nil"/>
             </w:tcBorders>
           </w:tcPr>
@@ -1724,7 +1798,7 @@
             <w:tcBorders>
               <w:top w:val="nil"/>
               <w:left w:val="nil"/>
-              <w:bottom w:val="single" w:sz="4" w:color="DDE3EA" w:space="0"/>
+              <w:bottom w:val="single" w:sz="4" w:color="E6EAF0" w:space="0"/>
               <w:right w:val="nil"/>
             </w:tcBorders>
           </w:tcPr>
@@ -1748,7 +1822,7 @@
             <w:tcBorders>
               <w:top w:val="nil"/>
               <w:left w:val="nil"/>
-              <w:bottom w:val="single" w:sz="4" w:color="DDE3EA" w:space="0"/>
+              <w:bottom w:val="single" w:sz="4" w:color="E6EAF0" w:space="0"/>
               <w:right w:val="nil"/>
             </w:tcBorders>
           </w:tcPr>
@@ -1772,7 +1846,7 @@
             <w:tcBorders>
               <w:top w:val="nil"/>
               <w:left w:val="nil"/>
-              <w:bottom w:val="single" w:sz="4" w:color="DDE3EA" w:space="0"/>
+              <w:bottom w:val="single" w:sz="4" w:color="E6EAF0" w:space="0"/>
               <w:right w:val="nil"/>
             </w:tcBorders>
           </w:tcPr>
@@ -1799,7 +1873,7 @@
             <w:tcBorders>
               <w:top w:val="nil"/>
               <w:left w:val="nil"/>
-              <w:bottom w:val="single" w:sz="4" w:color="DDE3EA" w:space="0"/>
+              <w:bottom w:val="single" w:sz="4" w:color="E6EAF0" w:space="0"/>
               <w:right w:val="nil"/>
             </w:tcBorders>
           </w:tcPr>
@@ -1849,7 +1923,7 @@
             <w:tcBorders>
               <w:top w:val="nil"/>
               <w:left w:val="nil"/>
-              <w:bottom w:val="single" w:sz="4" w:color="DDE3EA" w:space="0"/>
+              <w:bottom w:val="single" w:sz="4" w:color="E6EAF0" w:space="0"/>
               <w:right w:val="nil"/>
             </w:tcBorders>
           </w:tcPr>
@@ -1873,7 +1947,7 @@
             <w:tcBorders>
               <w:top w:val="nil"/>
               <w:left w:val="nil"/>
-              <w:bottom w:val="single" w:sz="4" w:color="DDE3EA" w:space="0"/>
+              <w:bottom w:val="single" w:sz="4" w:color="E6EAF0" w:space="0"/>
               <w:right w:val="nil"/>
             </w:tcBorders>
           </w:tcPr>
@@ -1897,7 +1971,7 @@
             <w:tcBorders>
               <w:top w:val="nil"/>
               <w:left w:val="nil"/>
-              <w:bottom w:val="single" w:sz="4" w:color="DDE3EA" w:space="0"/>
+              <w:bottom w:val="single" w:sz="4" w:color="E6EAF0" w:space="0"/>
               <w:right w:val="nil"/>
             </w:tcBorders>
           </w:tcPr>
@@ -1921,7 +1995,7 @@
             <w:tcBorders>
               <w:top w:val="nil"/>
               <w:left w:val="nil"/>
-              <w:bottom w:val="single" w:sz="4" w:color="DDE3EA" w:space="0"/>
+              <w:bottom w:val="single" w:sz="4" w:color="E6EAF0" w:space="0"/>
               <w:right w:val="nil"/>
             </w:tcBorders>
           </w:tcPr>
@@ -1948,7 +2022,7 @@
             <w:tcBorders>
               <w:top w:val="nil"/>
               <w:left w:val="nil"/>
-              <w:bottom w:val="single" w:sz="4" w:color="DDE3EA" w:space="0"/>
+              <w:bottom w:val="single" w:sz="4" w:color="E6EAF0" w:space="0"/>
               <w:right w:val="nil"/>
             </w:tcBorders>
           </w:tcPr>
@@ -1998,7 +2072,7 @@
             <w:tcBorders>
               <w:top w:val="nil"/>
               <w:left w:val="nil"/>
-              <w:bottom w:val="single" w:sz="4" w:color="DDE3EA" w:space="0"/>
+              <w:bottom w:val="single" w:sz="4" w:color="E6EAF0" w:space="0"/>
               <w:right w:val="nil"/>
             </w:tcBorders>
           </w:tcPr>
@@ -2022,7 +2096,7 @@
             <w:tcBorders>
               <w:top w:val="nil"/>
               <w:left w:val="nil"/>
-              <w:bottom w:val="single" w:sz="4" w:color="DDE3EA" w:space="0"/>
+              <w:bottom w:val="single" w:sz="4" w:color="E6EAF0" w:space="0"/>
               <w:right w:val="nil"/>
             </w:tcBorders>
           </w:tcPr>
@@ -2046,7 +2120,7 @@
             <w:tcBorders>
               <w:top w:val="nil"/>
               <w:left w:val="nil"/>
-              <w:bottom w:val="single" w:sz="4" w:color="DDE3EA" w:space="0"/>
+              <w:bottom w:val="single" w:sz="4" w:color="E6EAF0" w:space="0"/>
               <w:right w:val="nil"/>
             </w:tcBorders>
           </w:tcPr>
@@ -2070,7 +2144,7 @@
             <w:tcBorders>
               <w:top w:val="nil"/>
               <w:left w:val="nil"/>
-              <w:bottom w:val="single" w:sz="4" w:color="DDE3EA" w:space="0"/>
+              <w:bottom w:val="single" w:sz="4" w:color="E6EAF0" w:space="0"/>
               <w:right w:val="nil"/>
             </w:tcBorders>
           </w:tcPr>
@@ -2097,7 +2171,7 @@
             <w:tcBorders>
               <w:top w:val="nil"/>
               <w:left w:val="nil"/>
-              <w:bottom w:val="single" w:sz="4" w:color="DDE3EA" w:space="0"/>
+              <w:bottom w:val="single" w:sz="4" w:color="E6EAF0" w:space="0"/>
               <w:right w:val="nil"/>
             </w:tcBorders>
           </w:tcPr>
@@ -2147,7 +2221,7 @@
             <w:tcBorders>
               <w:top w:val="nil"/>
               <w:left w:val="nil"/>
-              <w:bottom w:val="single" w:sz="4" w:color="DDE3EA" w:space="0"/>
+              <w:bottom w:val="single" w:sz="4" w:color="E6EAF0" w:space="0"/>
               <w:right w:val="nil"/>
             </w:tcBorders>
           </w:tcPr>
@@ -2171,7 +2245,7 @@
             <w:tcBorders>
               <w:top w:val="nil"/>
               <w:left w:val="nil"/>
-              <w:bottom w:val="single" w:sz="4" w:color="DDE3EA" w:space="0"/>
+              <w:bottom w:val="single" w:sz="4" w:color="E6EAF0" w:space="0"/>
               <w:right w:val="nil"/>
             </w:tcBorders>
           </w:tcPr>
@@ -2195,7 +2269,7 @@
             <w:tcBorders>
               <w:top w:val="nil"/>
               <w:left w:val="nil"/>
-              <w:bottom w:val="single" w:sz="4" w:color="DDE3EA" w:space="0"/>
+              <w:bottom w:val="single" w:sz="4" w:color="E6EAF0" w:space="0"/>
               <w:right w:val="nil"/>
             </w:tcBorders>
             <w:shd w:val="clear" w:color="auto" w:fill="E3F3E8"/>
@@ -2220,7 +2294,7 @@
             <w:tcBorders>
               <w:top w:val="nil"/>
               <w:left w:val="nil"/>
-              <w:bottom w:val="single" w:sz="4" w:color="DDE3EA" w:space="0"/>
+              <w:bottom w:val="single" w:sz="4" w:color="E6EAF0" w:space="0"/>
               <w:right w:val="nil"/>
             </w:tcBorders>
           </w:tcPr>
@@ -2247,7 +2321,7 @@
             <w:tcBorders>
               <w:top w:val="nil"/>
               <w:left w:val="nil"/>
-              <w:bottom w:val="single" w:sz="4" w:color="DDE3EA" w:space="0"/>
+              <w:bottom w:val="single" w:sz="4" w:color="E6EAF0" w:space="0"/>
               <w:right w:val="nil"/>
             </w:tcBorders>
           </w:tcPr>
@@ -2314,7 +2388,7 @@
             <w:tcBorders>
               <w:top w:val="nil"/>
               <w:left w:val="nil"/>
-              <w:bottom w:val="single" w:sz="4" w:color="DDE3EA" w:space="0"/>
+              <w:bottom w:val="single" w:sz="4" w:color="E6EAF0" w:space="0"/>
               <w:right w:val="nil"/>
             </w:tcBorders>
           </w:tcPr>
@@ -2338,7 +2412,7 @@
             <w:tcBorders>
               <w:top w:val="nil"/>
               <w:left w:val="nil"/>
-              <w:bottom w:val="single" w:sz="4" w:color="DDE3EA" w:space="0"/>
+              <w:bottom w:val="single" w:sz="4" w:color="E6EAF0" w:space="0"/>
               <w:right w:val="nil"/>
             </w:tcBorders>
           </w:tcPr>
@@ -2362,7 +2436,7 @@
             <w:tcBorders>
               <w:top w:val="nil"/>
               <w:left w:val="nil"/>
-              <w:bottom w:val="single" w:sz="4" w:color="DDE3EA" w:space="0"/>
+              <w:bottom w:val="single" w:sz="4" w:color="E6EAF0" w:space="0"/>
               <w:right w:val="nil"/>
             </w:tcBorders>
           </w:tcPr>
@@ -2386,7 +2460,7 @@
             <w:tcBorders>
               <w:top w:val="nil"/>
               <w:left w:val="nil"/>
-              <w:bottom w:val="single" w:sz="4" w:color="DDE3EA" w:space="0"/>
+              <w:bottom w:val="single" w:sz="4" w:color="E6EAF0" w:space="0"/>
               <w:right w:val="nil"/>
             </w:tcBorders>
           </w:tcPr>
@@ -2413,7 +2487,7 @@
             <w:tcBorders>
               <w:top w:val="nil"/>
               <w:left w:val="nil"/>
-              <w:bottom w:val="single" w:sz="4" w:color="DDE3EA" w:space="0"/>
+              <w:bottom w:val="single" w:sz="4" w:color="E6EAF0" w:space="0"/>
               <w:right w:val="nil"/>
             </w:tcBorders>
           </w:tcPr>
@@ -2446,7 +2520,7 @@
             <w:tcBorders>
               <w:top w:val="nil"/>
               <w:left w:val="nil"/>
-              <w:bottom w:val="single" w:sz="4" w:color="DDE3EA" w:space="0"/>
+              <w:bottom w:val="single" w:sz="4" w:color="E6EAF0" w:space="0"/>
               <w:right w:val="nil"/>
             </w:tcBorders>
           </w:tcPr>
@@ -2470,7 +2544,7 @@
             <w:tcBorders>
               <w:top w:val="nil"/>
               <w:left w:val="nil"/>
-              <w:bottom w:val="single" w:sz="4" w:color="DDE3EA" w:space="0"/>
+              <w:bottom w:val="single" w:sz="4" w:color="E6EAF0" w:space="0"/>
               <w:right w:val="nil"/>
             </w:tcBorders>
           </w:tcPr>
@@ -2494,7 +2568,7 @@
             <w:tcBorders>
               <w:top w:val="nil"/>
               <w:left w:val="nil"/>
-              <w:bottom w:val="single" w:sz="4" w:color="DDE3EA" w:space="0"/>
+              <w:bottom w:val="single" w:sz="4" w:color="E6EAF0" w:space="0"/>
               <w:right w:val="nil"/>
             </w:tcBorders>
           </w:tcPr>
@@ -2518,7 +2592,7 @@
             <w:tcBorders>
               <w:top w:val="nil"/>
               <w:left w:val="nil"/>
-              <w:bottom w:val="single" w:sz="4" w:color="DDE3EA" w:space="0"/>
+              <w:bottom w:val="single" w:sz="4" w:color="E6EAF0" w:space="0"/>
               <w:right w:val="nil"/>
             </w:tcBorders>
           </w:tcPr>
@@ -2551,7 +2625,7 @@
       <w:r>
         <w:rPr>
           <w:b w:val="0"/>
-          <w:color w:val="5F6B7A"/>
+          <w:color w:val="667085"/>
           <w:sz w:val="16"/>
         </w:rPr>
         <w:t>Colours: green change – the metric is improving, red – worsening. Latest-period cell background: green – good level, amber – average, red – weak (tool benchmarks, config/metric_rules.yaml).</w:t>
@@ -2564,7 +2638,7 @@
       <w:r>
         <w:rPr>
           <w:b w:val="0"/>
-          <w:color w:val="5F6B7A"/>
+          <w:color w:val="667085"/>
           <w:sz w:val="16"/>
         </w:rPr>
         <w:t>* – taken from the report summary;  ᶜ – calculated by the tool. Small numbers next to text link to the source (opens the document at the cited page).</w:t>
@@ -2610,7 +2684,7 @@
       <w:pPr>
         <w:keepNext/>
         <w:pBdr>
-          <w:bottom w:val="single" w:sz="8" w:color="1F4E79" w:space="4"/>
+          <w:bottom w:val="single" w:sz="8" w:color="12355B" w:space="4"/>
         </w:pBdr>
         <w:tabs>
           <w:tab w:pos="482" w:val="left"/>
@@ -2623,13 +2697,13 @@
           <w:color w:val="2A78D6"/>
           <w:sz w:val="18"/>
         </w:rPr>
-        <w:t>04</w:t>
+        <w:t>03</w:t>
         <w:tab/>
       </w:r>
       <w:r>
         <w:rPr>
           <w:b/>
-          <w:color w:val="1F4E79"/>
+          <w:color w:val="12355B"/>
           <w:sz w:val="28"/>
         </w:rPr>
         <w:t>Business performance review</w:t>
@@ -2788,7 +2862,7 @@
       <w:pPr>
         <w:keepNext/>
         <w:pBdr>
-          <w:bottom w:val="single" w:sz="8" w:color="1F4E79" w:space="4"/>
+          <w:bottom w:val="single" w:sz="8" w:color="12355B" w:space="4"/>
         </w:pBdr>
         <w:tabs>
           <w:tab w:pos="482" w:val="left"/>
@@ -2801,13 +2875,13 @@
           <w:color w:val="2A78D6"/>
           <w:sz w:val="18"/>
         </w:rPr>
-        <w:t>05</w:t>
+        <w:t>04</w:t>
         <w:tab/>
       </w:r>
       <w:r>
         <w:rPr>
           <w:b/>
-          <w:color w:val="1F4E79"/>
+          <w:color w:val="12355B"/>
           <w:sz w:val="28"/>
         </w:rPr>
         <w:t>Financials</w:t>
@@ -2959,7 +3033,7 @@
       <w:pPr>
         <w:keepNext/>
         <w:pBdr>
-          <w:bottom w:val="single" w:sz="8" w:color="1F4E79" w:space="4"/>
+          <w:bottom w:val="single" w:sz="8" w:color="12355B" w:space="4"/>
         </w:pBdr>
         <w:tabs>
           <w:tab w:pos="482" w:val="left"/>
@@ -2972,13 +3046,13 @@
           <w:color w:val="2A78D6"/>
           <w:sz w:val="18"/>
         </w:rPr>
-        <w:t>06</w:t>
+        <w:t>05</w:t>
         <w:tab/>
       </w:r>
       <w:r>
         <w:rPr>
           <w:b/>
-          <w:color w:val="1F4E79"/>
+          <w:color w:val="12355B"/>
           <w:sz w:val="28"/>
         </w:rPr>
         <w:t>Past plans vs outcomes</w:t>
@@ -3015,12 +3089,11 @@
           <w:tcPr>
             <w:tcW w:type="dxa" w:w="2578"/>
             <w:tcBorders>
-              <w:top w:val="single" w:sz="12" w:color="1F4E79" w:space="0"/>
+              <w:top w:val="nil"/>
               <w:left w:val="nil"/>
-              <w:bottom w:val="single" w:sz="4" w:color="C9D3DE" w:space="0"/>
+              <w:bottom w:val="single" w:sz="8" w:color="12355B" w:space="0"/>
               <w:right w:val="nil"/>
             </w:tcBorders>
-            <w:shd w:val="clear" w:color="auto" w:fill="EAF1F8"/>
           </w:tcPr>
           <w:p>
             <w:pPr>
@@ -3030,8 +3103,8 @@
               <w:rPr>
                 <w:b/>
                 <w:caps/>
-                <w:color w:val="1F4E79"/>
-                <w:sz w:val="16"/>
+                <w:color w:val="667085"/>
+                <w:sz w:val="14"/>
               </w:rPr>
               <w:t>Plan / target</w:t>
             </w:r>
@@ -3041,12 +3114,11 @@
           <w:tcPr>
             <w:tcW w:type="dxa" w:w="2578"/>
             <w:tcBorders>
-              <w:top w:val="single" w:sz="12" w:color="1F4E79" w:space="0"/>
+              <w:top w:val="nil"/>
               <w:left w:val="nil"/>
-              <w:bottom w:val="single" w:sz="4" w:color="C9D3DE" w:space="0"/>
+              <w:bottom w:val="single" w:sz="8" w:color="12355B" w:space="0"/>
               <w:right w:val="nil"/>
             </w:tcBorders>
-            <w:shd w:val="clear" w:color="auto" w:fill="EAF1F8"/>
           </w:tcPr>
           <w:p>
             <w:pPr>
@@ -3056,8 +3128,8 @@
               <w:rPr>
                 <w:b/>
                 <w:caps/>
-                <w:color w:val="1F4E79"/>
-                <w:sz w:val="16"/>
+                <w:color w:val="667085"/>
+                <w:sz w:val="14"/>
               </w:rPr>
               <w:t>Outcome</w:t>
             </w:r>
@@ -3067,12 +3139,11 @@
           <w:tcPr>
             <w:tcW w:type="dxa" w:w="3138"/>
             <w:tcBorders>
-              <w:top w:val="single" w:sz="12" w:color="1F4E79" w:space="0"/>
+              <w:top w:val="nil"/>
               <w:left w:val="nil"/>
-              <w:bottom w:val="single" w:sz="4" w:color="C9D3DE" w:space="0"/>
+              <w:bottom w:val="single" w:sz="8" w:color="12355B" w:space="0"/>
               <w:right w:val="nil"/>
             </w:tcBorders>
-            <w:shd w:val="clear" w:color="auto" w:fill="EAF1F8"/>
           </w:tcPr>
           <w:p>
             <w:pPr>
@@ -3082,8 +3153,8 @@
               <w:rPr>
                 <w:b/>
                 <w:caps/>
-                <w:color w:val="1F4E79"/>
-                <w:sz w:val="16"/>
+                <w:color w:val="667085"/>
+                <w:sz w:val="14"/>
               </w:rPr>
               <w:t>What changed and why</w:t>
             </w:r>
@@ -3093,12 +3164,11 @@
           <w:tcPr>
             <w:tcW w:type="dxa" w:w="1345"/>
             <w:tcBorders>
-              <w:top w:val="single" w:sz="12" w:color="1F4E79" w:space="0"/>
+              <w:top w:val="nil"/>
               <w:left w:val="nil"/>
-              <w:bottom w:val="single" w:sz="4" w:color="C9D3DE" w:space="0"/>
+              <w:bottom w:val="single" w:sz="8" w:color="12355B" w:space="0"/>
               <w:right w:val="nil"/>
             </w:tcBorders>
-            <w:shd w:val="clear" w:color="auto" w:fill="EAF1F8"/>
           </w:tcPr>
           <w:p>
             <w:pPr>
@@ -3108,8 +3178,8 @@
               <w:rPr>
                 <w:b/>
                 <w:caps/>
-                <w:color w:val="1F4E79"/>
-                <w:sz w:val="16"/>
+                <w:color w:val="667085"/>
+                <w:sz w:val="14"/>
               </w:rPr>
               <w:t>Status</w:t>
             </w:r>
@@ -3123,7 +3193,7 @@
             <w:tcBorders>
               <w:top w:val="nil"/>
               <w:left w:val="nil"/>
-              <w:bottom w:val="single" w:sz="4" w:color="DDE3EA" w:space="0"/>
+              <w:bottom w:val="single" w:sz="4" w:color="E6EAF0" w:space="0"/>
               <w:right w:val="nil"/>
             </w:tcBorders>
           </w:tcPr>
@@ -3146,7 +3216,7 @@
             <w:tcBorders>
               <w:top w:val="nil"/>
               <w:left w:val="nil"/>
-              <w:bottom w:val="single" w:sz="4" w:color="DDE3EA" w:space="0"/>
+              <w:bottom w:val="single" w:sz="4" w:color="E6EAF0" w:space="0"/>
               <w:right w:val="nil"/>
             </w:tcBorders>
           </w:tcPr>
@@ -3196,7 +3266,7 @@
             <w:tcBorders>
               <w:top w:val="nil"/>
               <w:left w:val="nil"/>
-              <w:bottom w:val="single" w:sz="4" w:color="DDE3EA" w:space="0"/>
+              <w:bottom w:val="single" w:sz="4" w:color="E6EAF0" w:space="0"/>
               <w:right w:val="nil"/>
             </w:tcBorders>
           </w:tcPr>
@@ -3236,7 +3306,7 @@
             <w:tcBorders>
               <w:top w:val="nil"/>
               <w:left w:val="nil"/>
-              <w:bottom w:val="single" w:sz="4" w:color="DDE3EA" w:space="0"/>
+              <w:bottom w:val="single" w:sz="4" w:color="E6EAF0" w:space="0"/>
               <w:right w:val="nil"/>
             </w:tcBorders>
             <w:shd w:val="clear" w:color="auto" w:fill="E3F3E8"/>
@@ -3262,7 +3332,7 @@
             <w:tcBorders>
               <w:top w:val="nil"/>
               <w:left w:val="nil"/>
-              <w:bottom w:val="single" w:sz="4" w:color="DDE3EA" w:space="0"/>
+              <w:bottom w:val="single" w:sz="4" w:color="E6EAF0" w:space="0"/>
               <w:right w:val="nil"/>
             </w:tcBorders>
           </w:tcPr>
@@ -3285,7 +3355,7 @@
             <w:tcBorders>
               <w:top w:val="nil"/>
               <w:left w:val="nil"/>
-              <w:bottom w:val="single" w:sz="4" w:color="DDE3EA" w:space="0"/>
+              <w:bottom w:val="single" w:sz="4" w:color="E6EAF0" w:space="0"/>
               <w:right w:val="nil"/>
             </w:tcBorders>
           </w:tcPr>
@@ -3318,7 +3388,7 @@
             <w:tcBorders>
               <w:top w:val="nil"/>
               <w:left w:val="nil"/>
-              <w:bottom w:val="single" w:sz="4" w:color="DDE3EA" w:space="0"/>
+              <w:bottom w:val="single" w:sz="4" w:color="E6EAF0" w:space="0"/>
               <w:right w:val="nil"/>
             </w:tcBorders>
           </w:tcPr>
@@ -3358,7 +3428,7 @@
             <w:tcBorders>
               <w:top w:val="nil"/>
               <w:left w:val="nil"/>
-              <w:bottom w:val="single" w:sz="4" w:color="DDE3EA" w:space="0"/>
+              <w:bottom w:val="single" w:sz="4" w:color="E6EAF0" w:space="0"/>
               <w:right w:val="nil"/>
             </w:tcBorders>
             <w:shd w:val="clear" w:color="auto" w:fill="EAF1F8"/>
@@ -3384,7 +3454,7 @@
             <w:tcBorders>
               <w:top w:val="nil"/>
               <w:left w:val="nil"/>
-              <w:bottom w:val="single" w:sz="4" w:color="DDE3EA" w:space="0"/>
+              <w:bottom w:val="single" w:sz="4" w:color="E6EAF0" w:space="0"/>
               <w:right w:val="nil"/>
             </w:tcBorders>
           </w:tcPr>
@@ -3407,7 +3477,7 @@
             <w:tcBorders>
               <w:top w:val="nil"/>
               <w:left w:val="nil"/>
-              <w:bottom w:val="single" w:sz="4" w:color="DDE3EA" w:space="0"/>
+              <w:bottom w:val="single" w:sz="4" w:color="E6EAF0" w:space="0"/>
               <w:right w:val="nil"/>
             </w:tcBorders>
           </w:tcPr>
@@ -3457,7 +3527,7 @@
             <w:tcBorders>
               <w:top w:val="nil"/>
               <w:left w:val="nil"/>
-              <w:bottom w:val="single" w:sz="4" w:color="DDE3EA" w:space="0"/>
+              <w:bottom w:val="single" w:sz="4" w:color="E6EAF0" w:space="0"/>
               <w:right w:val="nil"/>
             </w:tcBorders>
           </w:tcPr>
@@ -3497,7 +3567,7 @@
             <w:tcBorders>
               <w:top w:val="nil"/>
               <w:left w:val="nil"/>
-              <w:bottom w:val="single" w:sz="4" w:color="DDE3EA" w:space="0"/>
+              <w:bottom w:val="single" w:sz="4" w:color="E6EAF0" w:space="0"/>
               <w:right w:val="nil"/>
             </w:tcBorders>
             <w:shd w:val="clear" w:color="auto" w:fill="EAF1F8"/>
@@ -3523,7 +3593,7 @@
             <w:tcBorders>
               <w:top w:val="nil"/>
               <w:left w:val="nil"/>
-              <w:bottom w:val="single" w:sz="4" w:color="DDE3EA" w:space="0"/>
+              <w:bottom w:val="single" w:sz="4" w:color="E6EAF0" w:space="0"/>
               <w:right w:val="nil"/>
             </w:tcBorders>
           </w:tcPr>
@@ -3546,7 +3616,7 @@
             <w:tcBorders>
               <w:top w:val="nil"/>
               <w:left w:val="nil"/>
-              <w:bottom w:val="single" w:sz="4" w:color="DDE3EA" w:space="0"/>
+              <w:bottom w:val="single" w:sz="4" w:color="E6EAF0" w:space="0"/>
               <w:right w:val="nil"/>
             </w:tcBorders>
           </w:tcPr>
@@ -3596,7 +3666,7 @@
             <w:tcBorders>
               <w:top w:val="nil"/>
               <w:left w:val="nil"/>
-              <w:bottom w:val="single" w:sz="4" w:color="DDE3EA" w:space="0"/>
+              <w:bottom w:val="single" w:sz="4" w:color="E6EAF0" w:space="0"/>
               <w:right w:val="nil"/>
             </w:tcBorders>
           </w:tcPr>
@@ -3636,7 +3706,7 @@
             <w:tcBorders>
               <w:top w:val="nil"/>
               <w:left w:val="nil"/>
-              <w:bottom w:val="single" w:sz="4" w:color="DDE3EA" w:space="0"/>
+              <w:bottom w:val="single" w:sz="4" w:color="E6EAF0" w:space="0"/>
               <w:right w:val="nil"/>
             </w:tcBorders>
             <w:shd w:val="clear" w:color="auto" w:fill="FDE7E5"/>
@@ -3665,7 +3735,7 @@
       <w:pPr>
         <w:keepNext/>
         <w:pBdr>
-          <w:bottom w:val="single" w:sz="8" w:color="1F4E79" w:space="4"/>
+          <w:bottom w:val="single" w:sz="8" w:color="12355B" w:space="4"/>
         </w:pBdr>
         <w:tabs>
           <w:tab w:pos="482" w:val="left"/>
@@ -3678,13 +3748,13 @@
           <w:color w:val="2A78D6"/>
           <w:sz w:val="18"/>
         </w:rPr>
-        <w:t>07</w:t>
+        <w:t>06</w:t>
         <w:tab/>
       </w:r>
       <w:r>
         <w:rPr>
           <w:b/>
-          <w:color w:val="1F4E79"/>
+          <w:color w:val="12355B"/>
           <w:sz w:val="28"/>
         </w:rPr>
         <w:t>Investor information &amp; conclusions</w:t>
@@ -3878,7 +3948,1092 @@
       <w:pPr>
         <w:keepNext/>
         <w:pBdr>
-          <w:bottom w:val="single" w:sz="8" w:color="1F4E79" w:space="4"/>
+          <w:bottom w:val="single" w:sz="8" w:color="12355B" w:space="4"/>
+        </w:pBdr>
+        <w:tabs>
+          <w:tab w:pos="482" w:val="left"/>
+        </w:tabs>
+        <w:spacing w:before="360" w:after="160"/>
+      </w:pPr>
+      <w:r>
+        <w:rPr>
+          <w:b/>
+          <w:color w:val="2A78D6"/>
+          <w:sz w:val="18"/>
+        </w:rPr>
+        <w:t>07</w:t>
+        <w:tab/>
+      </w:r>
+      <w:r>
+        <w:rPr>
+          <w:b/>
+          <w:color w:val="12355B"/>
+          <w:sz w:val="28"/>
+        </w:rPr>
+        <w:t>Market and environment</w:t>
+      </w:r>
+    </w:p>
+    <w:p>
+      <w:pPr>
+        <w:tabs>
+          <w:tab w:pos="255" w:val="left"/>
+        </w:tabs>
+        <w:spacing w:before="0" w:after="80"/>
+        <w:ind w:left="255" w:hanging="255"/>
+      </w:pPr>
+      <w:r>
+        <w:rPr>
+          <w:b/>
+          <w:color w:val="2A78D6"/>
+          <w:sz w:val="20"/>
+        </w:rPr>
+        <w:t>▪</w:t>
+        <w:tab/>
+      </w:r>
+      <w:r>
+        <w:rPr>
+          <w:b/>
+        </w:rPr>
+        <w:t>Costs and portfolio:</w:t>
+      </w:r>
+      <w:r>
+        <w:rPr>
+          <w:b w:val="0"/>
+        </w:rPr>
+        <w:t xml:space="preserve"> administrative expenses EUR 2.2m (1.9m), interest expenses EUR 3.7m (4.0m); investment assets fell to EUR 138.4m (165.0m) after EUR 27.7m of disposals and repayments</w:t>
+      </w:r>
+      <w:hyperlink r:id="rId16">
+        <w:r>
+          <w:rPr>
+            <w:color w:val="2A78D6"/>
+            <w:vertAlign w:val="superscript"/>
+            <w:sz w:val="17"/>
+          </w:rPr>
+          <w:t xml:space="preserve">17</w:t>
+        </w:r>
+      </w:hyperlink>
+      <w:r>
+        <w:rPr>
+          <w:b w:val="0"/>
+        </w:rPr>
+        <w:t>.</w:t>
+      </w:r>
+    </w:p>
+    <w:p>
+      <w:pPr>
+        <w:tabs>
+          <w:tab w:pos="255" w:val="left"/>
+        </w:tabs>
+        <w:spacing w:before="0" w:after="80"/>
+        <w:ind w:left="255" w:hanging="255"/>
+      </w:pPr>
+      <w:r>
+        <w:rPr>
+          <w:b/>
+          <w:color w:val="2A78D6"/>
+          <w:sz w:val="20"/>
+        </w:rPr>
+        <w:t>▪</w:t>
+        <w:tab/>
+      </w:r>
+      <w:r>
+        <w:rPr>
+          <w:b/>
+        </w:rPr>
+        <w:t>Power market:</w:t>
+      </w:r>
+      <w:r>
+        <w:rPr>
+          <w:b w:val="0"/>
+        </w:rPr>
+        <w:t xml:space="preserve"> management says current electricity market conditions and demand support the projects' viability</w:t>
+      </w:r>
+      <w:hyperlink r:id="rId27">
+        <w:r>
+          <w:rPr>
+            <w:color w:val="2A78D6"/>
+            <w:vertAlign w:val="superscript"/>
+            <w:sz w:val="17"/>
+          </w:rPr>
+          <w:t xml:space="preserve">18</w:t>
+        </w:r>
+      </w:hyperlink>
+      <w:r>
+        <w:rPr>
+          <w:b w:val="0"/>
+        </w:rPr>
+        <w:t>; in the mFRR balancing market Potentia Industriae earned EUR 1,356k and Rokvėja EUR 850k (to May)</w:t>
+      </w:r>
+      <w:hyperlink r:id="rId28">
+        <w:r>
+          <w:rPr>
+            <w:color w:val="2A78D6"/>
+            <w:vertAlign w:val="superscript"/>
+            <w:sz w:val="17"/>
+          </w:rPr>
+          <w:t xml:space="preserve">19</w:t>
+        </w:r>
+      </w:hyperlink>
+      <w:r>
+        <w:rPr>
+          <w:b w:val="0"/>
+        </w:rPr>
+        <w:t>.</w:t>
+      </w:r>
+    </w:p>
+    <w:p>
+      <w:pPr>
+        <w:tabs>
+          <w:tab w:pos="255" w:val="left"/>
+        </w:tabs>
+        <w:spacing w:before="0" w:after="80"/>
+        <w:ind w:left="255" w:hanging="255"/>
+      </w:pPr>
+      <w:r>
+        <w:rPr>
+          <w:b/>
+          <w:color w:val="2A78D6"/>
+          <w:sz w:val="20"/>
+        </w:rPr>
+        <w:t>▪</w:t>
+        <w:tab/>
+      </w:r>
+      <w:r>
+        <w:rPr>
+          <w:b/>
+        </w:rPr>
+        <w:t>Outlook:</w:t>
+      </w:r>
+      <w:r>
+        <w:rPr>
+          <w:b w:val="0"/>
+        </w:rPr>
+        <w:t xml:space="preserve"> the last solar projects (about 17 MW) are due to connect to the grid in December 2026</w:t>
+      </w:r>
+      <w:hyperlink r:id="rId28">
+        <w:r>
+          <w:rPr>
+            <w:color w:val="2A78D6"/>
+            <w:vertAlign w:val="superscript"/>
+            <w:sz w:val="17"/>
+          </w:rPr>
+          <w:t xml:space="preserve">19</w:t>
+        </w:r>
+      </w:hyperlink>
+      <w:r>
+        <w:rPr>
+          <w:b w:val="0"/>
+        </w:rPr>
+        <w:t>.</w:t>
+      </w:r>
+    </w:p>
+    <w:tbl>
+      <w:tblPr>
+        <w:tblW w:w="9639" w:type="dxa"/>
+        <w:tblBorders>
+          <w:top w:val="nil"/>
+          <w:left w:val="nil"/>
+          <w:bottom w:val="nil"/>
+          <w:right w:val="nil"/>
+          <w:insideH w:val="nil"/>
+          <w:insideV w:val="nil"/>
+        </w:tblBorders>
+        <w:tblLayout w:type="fixed"/>
+        <w:tblCellMar>
+          <w:top w:w="70" w:type="dxa"/>
+          <w:left w:w="100" w:type="dxa"/>
+          <w:bottom w:w="70" w:type="dxa"/>
+          <w:right w:w="100" w:type="dxa"/>
+        </w:tblCellMar>
+        <w:tblLook w:firstColumn="1" w:firstRow="1" w:lastColumn="0" w:lastRow="0" w:noHBand="0" w:noVBand="1" w:val="04A0"/>
+      </w:tblPr>
+      <w:tblGrid>
+        <w:gridCol w:w="3515"/>
+        <w:gridCol w:w="1814"/>
+        <w:gridCol w:w="1360"/>
+        <w:gridCol w:w="1360"/>
+        <w:gridCol w:w="1587"/>
+      </w:tblGrid>
+      <w:tr>
+        <w:tc>
+          <w:tcPr>
+            <w:tcW w:type="dxa" w:w="3515"/>
+            <w:tcBorders>
+              <w:top w:val="nil"/>
+              <w:left w:val="nil"/>
+              <w:bottom w:val="single" w:sz="8" w:color="12355B" w:space="0"/>
+              <w:right w:val="nil"/>
+            </w:tcBorders>
+          </w:tcPr>
+          <w:p>
+            <w:pPr>
+              <w:spacing w:before="0" w:after="0"/>
+            </w:pPr>
+            <w:r>
+              <w:rPr>
+                <w:b/>
+                <w:caps/>
+                <w:color w:val="667085"/>
+                <w:sz w:val="14"/>
+              </w:rPr>
+            </w:r>
+          </w:p>
+        </w:tc>
+        <w:tc>
+          <w:tcPr>
+            <w:tcW w:type="dxa" w:w="1814"/>
+            <w:tcBorders>
+              <w:top w:val="nil"/>
+              <w:left w:val="nil"/>
+              <w:bottom w:val="single" w:sz="8" w:color="12355B" w:space="0"/>
+              <w:right w:val="nil"/>
+            </w:tcBorders>
+          </w:tcPr>
+          <w:p>
+            <w:pPr>
+              <w:spacing w:before="0" w:after="0"/>
+              <w:jc w:val="right"/>
+            </w:pPr>
+            <w:r>
+              <w:rPr>
+                <w:b/>
+                <w:caps/>
+                <w:color w:val="667085"/>
+                <w:sz w:val="14"/>
+              </w:rPr>
+              <w:t>Now</w:t>
+            </w:r>
+          </w:p>
+        </w:tc>
+        <w:tc>
+          <w:tcPr>
+            <w:tcW w:type="dxa" w:w="1361"/>
+            <w:tcBorders>
+              <w:top w:val="nil"/>
+              <w:left w:val="nil"/>
+              <w:bottom w:val="single" w:sz="8" w:color="12355B" w:space="0"/>
+              <w:right w:val="nil"/>
+            </w:tcBorders>
+          </w:tcPr>
+          <w:p>
+            <w:pPr>
+              <w:spacing w:before="0" w:after="0"/>
+              <w:jc w:val="right"/>
+            </w:pPr>
+            <w:r>
+              <w:rPr>
+                <w:b/>
+                <w:caps/>
+                <w:color w:val="667085"/>
+                <w:sz w:val="14"/>
+              </w:rPr>
+              <w:t>3 months ago</w:t>
+            </w:r>
+          </w:p>
+        </w:tc>
+        <w:tc>
+          <w:tcPr>
+            <w:tcW w:type="dxa" w:w="1361"/>
+            <w:tcBorders>
+              <w:top w:val="nil"/>
+              <w:left w:val="nil"/>
+              <w:bottom w:val="single" w:sz="8" w:color="12355B" w:space="0"/>
+              <w:right w:val="nil"/>
+            </w:tcBorders>
+          </w:tcPr>
+          <w:p>
+            <w:pPr>
+              <w:spacing w:before="0" w:after="0"/>
+              <w:jc w:val="right"/>
+            </w:pPr>
+            <w:r>
+              <w:rPr>
+                <w:b/>
+                <w:caps/>
+                <w:color w:val="667085"/>
+                <w:sz w:val="14"/>
+              </w:rPr>
+              <w:t>12 months ago</w:t>
+            </w:r>
+          </w:p>
+        </w:tc>
+        <w:tc>
+          <w:tcPr>
+            <w:tcW w:type="dxa" w:w="1587"/>
+            <w:tcBorders>
+              <w:top w:val="nil"/>
+              <w:left w:val="nil"/>
+              <w:bottom w:val="single" w:sz="8" w:color="12355B" w:space="0"/>
+              <w:right w:val="nil"/>
+            </w:tcBorders>
+          </w:tcPr>
+          <w:p>
+            <w:pPr>
+              <w:spacing w:before="0" w:after="0"/>
+              <w:jc w:val="right"/>
+            </w:pPr>
+            <w:r>
+              <w:rPr>
+                <w:b/>
+                <w:caps/>
+                <w:color w:val="667085"/>
+                <w:sz w:val="14"/>
+              </w:rPr>
+              <w:t>12-month change</w:t>
+            </w:r>
+          </w:p>
+        </w:tc>
+      </w:tr>
+      <w:tr>
+        <w:tc>
+          <w:tcPr>
+            <w:tcW w:type="dxa" w:w="3515"/>
+            <w:tcBorders>
+              <w:top w:val="nil"/>
+              <w:left w:val="nil"/>
+              <w:bottom w:val="single" w:sz="4" w:color="E6EAF0" w:space="0"/>
+              <w:right w:val="nil"/>
+            </w:tcBorders>
+          </w:tcPr>
+          <w:p>
+            <w:pPr>
+              <w:spacing w:before="0" w:after="0"/>
+            </w:pPr>
+            <w:r>
+              <w:rPr>
+                <w:b w:val="0"/>
+                <w:sz w:val="17"/>
+              </w:rPr>
+              <w:t>ECB deposit facility rate</w:t>
+            </w:r>
+          </w:p>
+        </w:tc>
+        <w:tc>
+          <w:tcPr>
+            <w:tcW w:type="dxa" w:w="1814"/>
+            <w:tcBorders>
+              <w:top w:val="nil"/>
+              <w:left w:val="nil"/>
+              <w:bottom w:val="single" w:sz="4" w:color="E6EAF0" w:space="0"/>
+              <w:right w:val="nil"/>
+            </w:tcBorders>
+          </w:tcPr>
+          <w:p>
+            <w:pPr>
+              <w:spacing w:before="0" w:after="0"/>
+              <w:jc w:val="right"/>
+            </w:pPr>
+            <w:r>
+              <w:rPr>
+                <w:b w:val="0"/>
+                <w:sz w:val="17"/>
+              </w:rPr>
+              <w:t>2.50% (2026-09)</w:t>
+            </w:r>
+          </w:p>
+        </w:tc>
+        <w:tc>
+          <w:tcPr>
+            <w:tcW w:type="dxa" w:w="1361"/>
+            <w:tcBorders>
+              <w:top w:val="nil"/>
+              <w:left w:val="nil"/>
+              <w:bottom w:val="single" w:sz="4" w:color="E6EAF0" w:space="0"/>
+              <w:right w:val="nil"/>
+            </w:tcBorders>
+          </w:tcPr>
+          <w:p>
+            <w:pPr>
+              <w:spacing w:before="0" w:after="0"/>
+              <w:jc w:val="right"/>
+            </w:pPr>
+            <w:r>
+              <w:rPr>
+                <w:b w:val="0"/>
+                <w:sz w:val="17"/>
+              </w:rPr>
+              <w:t>2.25%</w:t>
+            </w:r>
+          </w:p>
+        </w:tc>
+        <w:tc>
+          <w:tcPr>
+            <w:tcW w:type="dxa" w:w="1361"/>
+            <w:tcBorders>
+              <w:top w:val="nil"/>
+              <w:left w:val="nil"/>
+              <w:bottom w:val="single" w:sz="4" w:color="E6EAF0" w:space="0"/>
+              <w:right w:val="nil"/>
+            </w:tcBorders>
+          </w:tcPr>
+          <w:p>
+            <w:pPr>
+              <w:spacing w:before="0" w:after="0"/>
+              <w:jc w:val="right"/>
+            </w:pPr>
+            <w:r>
+              <w:rPr>
+                <w:b w:val="0"/>
+                <w:sz w:val="17"/>
+              </w:rPr>
+              <w:t>–</w:t>
+            </w:r>
+          </w:p>
+        </w:tc>
+        <w:tc>
+          <w:tcPr>
+            <w:tcW w:type="dxa" w:w="1587"/>
+            <w:tcBorders>
+              <w:top w:val="nil"/>
+              <w:left w:val="nil"/>
+              <w:bottom w:val="single" w:sz="4" w:color="E6EAF0" w:space="0"/>
+              <w:right w:val="nil"/>
+            </w:tcBorders>
+          </w:tcPr>
+          <w:p>
+            <w:pPr>
+              <w:spacing w:before="0" w:after="0"/>
+              <w:jc w:val="right"/>
+            </w:pPr>
+            <w:r>
+              <w:rPr>
+                <w:b w:val="0"/>
+                <w:sz w:val="17"/>
+              </w:rPr>
+              <w:t>–</w:t>
+            </w:r>
+          </w:p>
+        </w:tc>
+      </w:tr>
+      <w:tr>
+        <w:tc>
+          <w:tcPr>
+            <w:tcW w:type="dxa" w:w="3515"/>
+            <w:tcBorders>
+              <w:top w:val="nil"/>
+              <w:left w:val="nil"/>
+              <w:bottom w:val="single" w:sz="4" w:color="E6EAF0" w:space="0"/>
+              <w:right w:val="nil"/>
+            </w:tcBorders>
+          </w:tcPr>
+          <w:p>
+            <w:pPr>
+              <w:spacing w:before="0" w:after="0"/>
+            </w:pPr>
+            <w:r>
+              <w:rPr>
+                <w:b w:val="0"/>
+                <w:sz w:val="17"/>
+              </w:rPr>
+              <w:t>3-month Euribor</w:t>
+            </w:r>
+          </w:p>
+        </w:tc>
+        <w:tc>
+          <w:tcPr>
+            <w:tcW w:type="dxa" w:w="1814"/>
+            <w:tcBorders>
+              <w:top w:val="nil"/>
+              <w:left w:val="nil"/>
+              <w:bottom w:val="single" w:sz="4" w:color="E6EAF0" w:space="0"/>
+              <w:right w:val="nil"/>
+            </w:tcBorders>
+          </w:tcPr>
+          <w:p>
+            <w:pPr>
+              <w:spacing w:before="0" w:after="0"/>
+              <w:jc w:val="right"/>
+            </w:pPr>
+            <w:r>
+              <w:rPr>
+                <w:b w:val="0"/>
+                <w:sz w:val="17"/>
+              </w:rPr>
+              <w:t>2.64% (2026-09)</w:t>
+            </w:r>
+          </w:p>
+        </w:tc>
+        <w:tc>
+          <w:tcPr>
+            <w:tcW w:type="dxa" w:w="1361"/>
+            <w:tcBorders>
+              <w:top w:val="nil"/>
+              <w:left w:val="nil"/>
+              <w:bottom w:val="single" w:sz="4" w:color="E6EAF0" w:space="0"/>
+              <w:right w:val="nil"/>
+            </w:tcBorders>
+          </w:tcPr>
+          <w:p>
+            <w:pPr>
+              <w:spacing w:before="0" w:after="0"/>
+              <w:jc w:val="right"/>
+            </w:pPr>
+            <w:r>
+              <w:rPr>
+                <w:b w:val="0"/>
+                <w:sz w:val="17"/>
+              </w:rPr>
+              <w:t>2.34%</w:t>
+            </w:r>
+          </w:p>
+        </w:tc>
+        <w:tc>
+          <w:tcPr>
+            <w:tcW w:type="dxa" w:w="1361"/>
+            <w:tcBorders>
+              <w:top w:val="nil"/>
+              <w:left w:val="nil"/>
+              <w:bottom w:val="single" w:sz="4" w:color="E6EAF0" w:space="0"/>
+              <w:right w:val="nil"/>
+            </w:tcBorders>
+          </w:tcPr>
+          <w:p>
+            <w:pPr>
+              <w:spacing w:before="0" w:after="0"/>
+              <w:jc w:val="right"/>
+            </w:pPr>
+            <w:r>
+              <w:rPr>
+                <w:b w:val="0"/>
+                <w:sz w:val="17"/>
+              </w:rPr>
+              <w:t>2.03%</w:t>
+            </w:r>
+          </w:p>
+        </w:tc>
+        <w:tc>
+          <w:tcPr>
+            <w:tcW w:type="dxa" w:w="1587"/>
+            <w:tcBorders>
+              <w:top w:val="nil"/>
+              <w:left w:val="nil"/>
+              <w:bottom w:val="single" w:sz="4" w:color="E6EAF0" w:space="0"/>
+              <w:right w:val="nil"/>
+            </w:tcBorders>
+          </w:tcPr>
+          <w:p>
+            <w:pPr>
+              <w:spacing w:before="0" w:after="0"/>
+              <w:jc w:val="right"/>
+            </w:pPr>
+            <w:r>
+              <w:rPr>
+                <w:b w:val="0"/>
+                <w:sz w:val="17"/>
+              </w:rPr>
+              <w:t>▲ 0.61 p. p.</w:t>
+            </w:r>
+          </w:p>
+        </w:tc>
+      </w:tr>
+      <w:tr>
+        <w:tc>
+          <w:tcPr>
+            <w:tcW w:type="dxa" w:w="3515"/>
+            <w:tcBorders>
+              <w:top w:val="nil"/>
+              <w:left w:val="nil"/>
+              <w:bottom w:val="single" w:sz="4" w:color="E6EAF0" w:space="0"/>
+              <w:right w:val="nil"/>
+            </w:tcBorders>
+          </w:tcPr>
+          <w:p>
+            <w:pPr>
+              <w:spacing w:before="0" w:after="0"/>
+            </w:pPr>
+            <w:r>
+              <w:rPr>
+                <w:b w:val="0"/>
+                <w:sz w:val="17"/>
+              </w:rPr>
+              <w:t>6-month Euribor</w:t>
+            </w:r>
+          </w:p>
+        </w:tc>
+        <w:tc>
+          <w:tcPr>
+            <w:tcW w:type="dxa" w:w="1814"/>
+            <w:tcBorders>
+              <w:top w:val="nil"/>
+              <w:left w:val="nil"/>
+              <w:bottom w:val="single" w:sz="4" w:color="E6EAF0" w:space="0"/>
+              <w:right w:val="nil"/>
+            </w:tcBorders>
+          </w:tcPr>
+          <w:p>
+            <w:pPr>
+              <w:spacing w:before="0" w:after="0"/>
+              <w:jc w:val="right"/>
+            </w:pPr>
+            <w:r>
+              <w:rPr>
+                <w:b w:val="0"/>
+                <w:sz w:val="17"/>
+              </w:rPr>
+              <w:t>2.92% (2026-09)</w:t>
+            </w:r>
+          </w:p>
+        </w:tc>
+        <w:tc>
+          <w:tcPr>
+            <w:tcW w:type="dxa" w:w="1361"/>
+            <w:tcBorders>
+              <w:top w:val="nil"/>
+              <w:left w:val="nil"/>
+              <w:bottom w:val="single" w:sz="4" w:color="E6EAF0" w:space="0"/>
+              <w:right w:val="nil"/>
+            </w:tcBorders>
+          </w:tcPr>
+          <w:p>
+            <w:pPr>
+              <w:spacing w:before="0" w:after="0"/>
+              <w:jc w:val="right"/>
+            </w:pPr>
+            <w:r>
+              <w:rPr>
+                <w:b w:val="0"/>
+                <w:sz w:val="17"/>
+              </w:rPr>
+              <w:t>2.60%</w:t>
+            </w:r>
+          </w:p>
+        </w:tc>
+        <w:tc>
+          <w:tcPr>
+            <w:tcW w:type="dxa" w:w="1361"/>
+            <w:tcBorders>
+              <w:top w:val="nil"/>
+              <w:left w:val="nil"/>
+              <w:bottom w:val="single" w:sz="4" w:color="E6EAF0" w:space="0"/>
+              <w:right w:val="nil"/>
+            </w:tcBorders>
+          </w:tcPr>
+          <w:p>
+            <w:pPr>
+              <w:spacing w:before="0" w:after="0"/>
+              <w:jc w:val="right"/>
+            </w:pPr>
+            <w:r>
+              <w:rPr>
+                <w:b w:val="0"/>
+                <w:sz w:val="17"/>
+              </w:rPr>
+              <w:t>2.10%</w:t>
+            </w:r>
+          </w:p>
+        </w:tc>
+        <w:tc>
+          <w:tcPr>
+            <w:tcW w:type="dxa" w:w="1587"/>
+            <w:tcBorders>
+              <w:top w:val="nil"/>
+              <w:left w:val="nil"/>
+              <w:bottom w:val="single" w:sz="4" w:color="E6EAF0" w:space="0"/>
+              <w:right w:val="nil"/>
+            </w:tcBorders>
+          </w:tcPr>
+          <w:p>
+            <w:pPr>
+              <w:spacing w:before="0" w:after="0"/>
+              <w:jc w:val="right"/>
+            </w:pPr>
+            <w:r>
+              <w:rPr>
+                <w:b w:val="0"/>
+                <w:sz w:val="17"/>
+              </w:rPr>
+              <w:t>▲ 0.82 p. p.</w:t>
+            </w:r>
+          </w:p>
+        </w:tc>
+      </w:tr>
+      <w:tr>
+        <w:tc>
+          <w:tcPr>
+            <w:tcW w:type="dxa" w:w="3515"/>
+            <w:tcBorders>
+              <w:top w:val="nil"/>
+              <w:left w:val="nil"/>
+              <w:bottom w:val="single" w:sz="4" w:color="E6EAF0" w:space="0"/>
+              <w:right w:val="nil"/>
+            </w:tcBorders>
+          </w:tcPr>
+          <w:p>
+            <w:pPr>
+              <w:spacing w:before="0" w:after="0"/>
+            </w:pPr>
+            <w:r>
+              <w:rPr>
+                <w:b w:val="0"/>
+                <w:sz w:val="17"/>
+              </w:rPr>
+              <w:t>12-month Euribor</w:t>
+            </w:r>
+          </w:p>
+        </w:tc>
+        <w:tc>
+          <w:tcPr>
+            <w:tcW w:type="dxa" w:w="1814"/>
+            <w:tcBorders>
+              <w:top w:val="nil"/>
+              <w:left w:val="nil"/>
+              <w:bottom w:val="single" w:sz="4" w:color="E6EAF0" w:space="0"/>
+              <w:right w:val="nil"/>
+            </w:tcBorders>
+          </w:tcPr>
+          <w:p>
+            <w:pPr>
+              <w:spacing w:before="0" w:after="0"/>
+              <w:jc w:val="right"/>
+            </w:pPr>
+            <w:r>
+              <w:rPr>
+                <w:b w:val="0"/>
+                <w:sz w:val="17"/>
+              </w:rPr>
+              <w:t>3.25% (2026-09)</w:t>
+            </w:r>
+          </w:p>
+        </w:tc>
+        <w:tc>
+          <w:tcPr>
+            <w:tcW w:type="dxa" w:w="1361"/>
+            <w:tcBorders>
+              <w:top w:val="nil"/>
+              <w:left w:val="nil"/>
+              <w:bottom w:val="single" w:sz="4" w:color="E6EAF0" w:space="0"/>
+              <w:right w:val="nil"/>
+            </w:tcBorders>
+          </w:tcPr>
+          <w:p>
+            <w:pPr>
+              <w:spacing w:before="0" w:after="0"/>
+              <w:jc w:val="right"/>
+            </w:pPr>
+            <w:r>
+              <w:rPr>
+                <w:b w:val="0"/>
+                <w:sz w:val="17"/>
+              </w:rPr>
+              <w:t>2.80%</w:t>
+            </w:r>
+          </w:p>
+        </w:tc>
+        <w:tc>
+          <w:tcPr>
+            <w:tcW w:type="dxa" w:w="1361"/>
+            <w:tcBorders>
+              <w:top w:val="nil"/>
+              <w:left w:val="nil"/>
+              <w:bottom w:val="single" w:sz="4" w:color="E6EAF0" w:space="0"/>
+              <w:right w:val="nil"/>
+            </w:tcBorders>
+          </w:tcPr>
+          <w:p>
+            <w:pPr>
+              <w:spacing w:before="0" w:after="0"/>
+              <w:jc w:val="right"/>
+            </w:pPr>
+            <w:r>
+              <w:rPr>
+                <w:b w:val="0"/>
+                <w:sz w:val="17"/>
+              </w:rPr>
+              <w:t>2.17%</w:t>
+            </w:r>
+          </w:p>
+        </w:tc>
+        <w:tc>
+          <w:tcPr>
+            <w:tcW w:type="dxa" w:w="1587"/>
+            <w:tcBorders>
+              <w:top w:val="nil"/>
+              <w:left w:val="nil"/>
+              <w:bottom w:val="single" w:sz="4" w:color="E6EAF0" w:space="0"/>
+              <w:right w:val="nil"/>
+            </w:tcBorders>
+          </w:tcPr>
+          <w:p>
+            <w:pPr>
+              <w:spacing w:before="0" w:after="0"/>
+              <w:jc w:val="right"/>
+            </w:pPr>
+            <w:r>
+              <w:rPr>
+                <w:b w:val="0"/>
+                <w:sz w:val="17"/>
+              </w:rPr>
+              <w:t>▲ 1.08 p. p.</w:t>
+            </w:r>
+          </w:p>
+        </w:tc>
+      </w:tr>
+      <w:tr>
+        <w:tc>
+          <w:tcPr>
+            <w:tcW w:type="dxa" w:w="3515"/>
+            <w:tcBorders>
+              <w:top w:val="nil"/>
+              <w:left w:val="nil"/>
+              <w:bottom w:val="single" w:sz="4" w:color="E6EAF0" w:space="0"/>
+              <w:right w:val="nil"/>
+            </w:tcBorders>
+          </w:tcPr>
+          <w:p>
+            <w:pPr>
+              <w:spacing w:before="0" w:after="0"/>
+            </w:pPr>
+            <w:r>
+              <w:rPr>
+                <w:b w:val="0"/>
+                <w:sz w:val="17"/>
+              </w:rPr>
+              <w:t>Euro area AAA government 10-year yield</w:t>
+            </w:r>
+          </w:p>
+        </w:tc>
+        <w:tc>
+          <w:tcPr>
+            <w:tcW w:type="dxa" w:w="1814"/>
+            <w:tcBorders>
+              <w:top w:val="nil"/>
+              <w:left w:val="nil"/>
+              <w:bottom w:val="single" w:sz="4" w:color="E6EAF0" w:space="0"/>
+              <w:right w:val="nil"/>
+            </w:tcBorders>
+          </w:tcPr>
+          <w:p>
+            <w:pPr>
+              <w:spacing w:before="0" w:after="0"/>
+              <w:jc w:val="right"/>
+            </w:pPr>
+            <w:r>
+              <w:rPr>
+                <w:b w:val="0"/>
+                <w:sz w:val="17"/>
+              </w:rPr>
+              <w:t>3.43% (2026-10)</w:t>
+            </w:r>
+          </w:p>
+        </w:tc>
+        <w:tc>
+          <w:tcPr>
+            <w:tcW w:type="dxa" w:w="1361"/>
+            <w:tcBorders>
+              <w:top w:val="nil"/>
+              <w:left w:val="nil"/>
+              <w:bottom w:val="single" w:sz="4" w:color="E6EAF0" w:space="0"/>
+              <w:right w:val="nil"/>
+            </w:tcBorders>
+          </w:tcPr>
+          <w:p>
+            <w:pPr>
+              <w:spacing w:before="0" w:after="0"/>
+              <w:jc w:val="right"/>
+            </w:pPr>
+            <w:r>
+              <w:rPr>
+                <w:b w:val="0"/>
+                <w:sz w:val="17"/>
+              </w:rPr>
+              <w:t>3.23%</w:t>
+            </w:r>
+          </w:p>
+        </w:tc>
+        <w:tc>
+          <w:tcPr>
+            <w:tcW w:type="dxa" w:w="1361"/>
+            <w:tcBorders>
+              <w:top w:val="nil"/>
+              <w:left w:val="nil"/>
+              <w:bottom w:val="single" w:sz="4" w:color="E6EAF0" w:space="0"/>
+              <w:right w:val="nil"/>
+            </w:tcBorders>
+          </w:tcPr>
+          <w:p>
+            <w:pPr>
+              <w:spacing w:before="0" w:after="0"/>
+              <w:jc w:val="right"/>
+            </w:pPr>
+            <w:r>
+              <w:rPr>
+                <w:b w:val="0"/>
+                <w:sz w:val="17"/>
+              </w:rPr>
+              <w:t>2.72%</w:t>
+            </w:r>
+          </w:p>
+        </w:tc>
+        <w:tc>
+          <w:tcPr>
+            <w:tcW w:type="dxa" w:w="1587"/>
+            <w:tcBorders>
+              <w:top w:val="nil"/>
+              <w:left w:val="nil"/>
+              <w:bottom w:val="single" w:sz="4" w:color="E6EAF0" w:space="0"/>
+              <w:right w:val="nil"/>
+            </w:tcBorders>
+          </w:tcPr>
+          <w:p>
+            <w:pPr>
+              <w:spacing w:before="0" w:after="0"/>
+              <w:jc w:val="right"/>
+            </w:pPr>
+            <w:r>
+              <w:rPr>
+                <w:b w:val="0"/>
+                <w:sz w:val="17"/>
+              </w:rPr>
+              <w:t>▲ 0.71 p. p.</w:t>
+            </w:r>
+          </w:p>
+        </w:tc>
+      </w:tr>
+      <w:tr>
+        <w:tc>
+          <w:tcPr>
+            <w:tcW w:type="dxa" w:w="3515"/>
+            <w:tcBorders>
+              <w:top w:val="nil"/>
+              <w:left w:val="nil"/>
+              <w:bottom w:val="single" w:sz="4" w:color="E6EAF0" w:space="0"/>
+              <w:right w:val="nil"/>
+            </w:tcBorders>
+          </w:tcPr>
+          <w:p>
+            <w:pPr>
+              <w:spacing w:before="0" w:after="0"/>
+            </w:pPr>
+            <w:r>
+              <w:rPr>
+                <w:b w:val="0"/>
+                <w:sz w:val="17"/>
+              </w:rPr>
+              <w:t>Euro area inflation (HICP, annual)</w:t>
+            </w:r>
+          </w:p>
+        </w:tc>
+        <w:tc>
+          <w:tcPr>
+            <w:tcW w:type="dxa" w:w="1814"/>
+            <w:tcBorders>
+              <w:top w:val="nil"/>
+              <w:left w:val="nil"/>
+              <w:bottom w:val="single" w:sz="4" w:color="E6EAF0" w:space="0"/>
+              <w:right w:val="nil"/>
+            </w:tcBorders>
+          </w:tcPr>
+          <w:p>
+            <w:pPr>
+              <w:spacing w:before="0" w:after="0"/>
+              <w:jc w:val="right"/>
+            </w:pPr>
+            <w:r>
+              <w:rPr>
+                <w:b w:val="0"/>
+                <w:sz w:val="17"/>
+              </w:rPr>
+              <w:t>1.90% (2025-12)</w:t>
+            </w:r>
+          </w:p>
+        </w:tc>
+        <w:tc>
+          <w:tcPr>
+            <w:tcW w:type="dxa" w:w="1361"/>
+            <w:tcBorders>
+              <w:top w:val="nil"/>
+              <w:left w:val="nil"/>
+              <w:bottom w:val="single" w:sz="4" w:color="E6EAF0" w:space="0"/>
+              <w:right w:val="nil"/>
+            </w:tcBorders>
+          </w:tcPr>
+          <w:p>
+            <w:pPr>
+              <w:spacing w:before="0" w:after="0"/>
+              <w:jc w:val="right"/>
+            </w:pPr>
+            <w:r>
+              <w:rPr>
+                <w:b w:val="0"/>
+                <w:sz w:val="17"/>
+              </w:rPr>
+              <w:t>2.20%</w:t>
+            </w:r>
+          </w:p>
+        </w:tc>
+        <w:tc>
+          <w:tcPr>
+            <w:tcW w:type="dxa" w:w="1361"/>
+            <w:tcBorders>
+              <w:top w:val="nil"/>
+              <w:left w:val="nil"/>
+              <w:bottom w:val="single" w:sz="4" w:color="E6EAF0" w:space="0"/>
+              <w:right w:val="nil"/>
+            </w:tcBorders>
+          </w:tcPr>
+          <w:p>
+            <w:pPr>
+              <w:spacing w:before="0" w:after="0"/>
+              <w:jc w:val="right"/>
+            </w:pPr>
+            <w:r>
+              <w:rPr>
+                <w:b w:val="0"/>
+                <w:sz w:val="17"/>
+              </w:rPr>
+              <w:t>2.40%</w:t>
+            </w:r>
+          </w:p>
+        </w:tc>
+        <w:tc>
+          <w:tcPr>
+            <w:tcW w:type="dxa" w:w="1587"/>
+            <w:tcBorders>
+              <w:top w:val="nil"/>
+              <w:left w:val="nil"/>
+              <w:bottom w:val="single" w:sz="4" w:color="E6EAF0" w:space="0"/>
+              <w:right w:val="nil"/>
+            </w:tcBorders>
+          </w:tcPr>
+          <w:p>
+            <w:pPr>
+              <w:spacing w:before="0" w:after="0"/>
+              <w:jc w:val="right"/>
+            </w:pPr>
+            <w:r>
+              <w:rPr>
+                <w:b w:val="0"/>
+                <w:sz w:val="17"/>
+              </w:rPr>
+              <w:t>▼ 0.50 p. p.</w:t>
+            </w:r>
+          </w:p>
+        </w:tc>
+      </w:tr>
+    </w:tbl>
+    <w:p>
+      <w:pPr>
+        <w:spacing w:before="0" w:after="40"/>
+      </w:pPr>
+    </w:p>
+    <w:p>
+      <w:pPr>
+        <w:spacing w:before="40" w:after="60"/>
+      </w:pPr>
+      <w:r>
+        <w:rPr>
+          <w:b w:val="0"/>
+          <w:color w:val="667085"/>
+          <w:sz w:val="16"/>
+        </w:rPr>
+        <w:t>Euro area rates and inflation (ECB data, end-of-month value; Euribor and inflation – monthly average). Relevant for floating-rate and reset bonds and refinancing costs.</w:t>
+      </w:r>
+    </w:p>
+    <w:p>
+      <w:pPr>
+        <w:keepNext/>
+        <w:pBdr>
+          <w:bottom w:val="single" w:sz="8" w:color="12355B" w:space="4"/>
         </w:pBdr>
         <w:tabs>
           <w:tab w:pos="482" w:val="left"/>
@@ -3897,7 +5052,7 @@
       <w:r>
         <w:rPr>
           <w:b/>
-          <w:color w:val="1F4E79"/>
+          <w:color w:val="12355B"/>
           <w:sz w:val="28"/>
         </w:rPr>
         <w:t>In the press</w:t>
@@ -3910,7 +5065,7 @@
       <w:r>
         <w:rPr>
           <w:b w:val="0"/>
-          <w:color w:val="5F6B7A"/>
+          <w:color w:val="667085"/>
           <w:sz w:val="18"/>
         </w:rPr>
         <w:t>Automatic news scan (Google News, LT), 2026-07-24 – 2026-10-22: 1 articles.</w:t>
@@ -3959,7 +5114,7 @@
             <w:r>
               <w:rPr>
                 <w:b w:val="0"/>
-                <w:color w:val="1A1A1A"/>
+                <w:color w:val="1B2430"/>
                 <w:sz w:val="17"/>
               </w:rPr>
               <w:t>2026-10-13</w:t>
@@ -4005,10 +5160,10 @@
             <w:pPr>
               <w:spacing w:before="0" w:after="0"/>
             </w:pPr>
-            <w:hyperlink r:id="rId27">
+            <w:hyperlink r:id="rId29">
               <w:r>
                 <w:rPr>
-                  <w:color w:val="1A1A1A"/>
+                  <w:color w:val="1B2430"/>
                   <w:sz w:val="18"/>
                 </w:rPr>
                 <w:t xml:space="preserve">UAB “Atsinaujinančios energetikos investicijos” skelbia 2026 m. rugsėjo mėn. GAV</w:t>
@@ -4017,7 +5172,7 @@
             <w:r>
               <w:rPr>
                 <w:b w:val="0"/>
-                <w:color w:val="5F6B7A"/>
+                <w:color w:val="667085"/>
                 <w:sz w:val="15"/>
               </w:rPr>
               <w:t xml:space="preserve">   GlobeNewswire</w:t>
@@ -4035,7 +5190,7 @@
       <w:pPr>
         <w:keepNext/>
         <w:pBdr>
-          <w:bottom w:val="single" w:sz="8" w:color="1F4E79" w:space="4"/>
+          <w:bottom w:val="single" w:sz="8" w:color="12355B" w:space="4"/>
         </w:pBdr>
         <w:tabs>
           <w:tab w:pos="482" w:val="left"/>
@@ -4054,7 +5209,7 @@
       <w:r>
         <w:rPr>
           <w:b/>
-          <w:color w:val="1F4E79"/>
+          <w:color w:val="12355B"/>
           <w:sz w:val="28"/>
         </w:rPr>
         <w:t>ESG report</w:t>
@@ -4063,7 +5218,7 @@
     <w:p>
       <w:pPr>
         <w:keepNext/>
-        <w:shd w:val="clear" w:color="auto" w:fill="EAF1F8"/>
+        <w:shd w:val="clear" w:color="auto" w:fill="EEF3F8"/>
         <w:spacing w:before="200" w:after="80"/>
         <w:ind w:left="85"/>
       </w:pPr>
@@ -4071,7 +5226,7 @@
         <w:rPr>
           <w:b/>
           <w:caps/>
-          <w:color w:val="1F4E79"/>
+          <w:color w:val="12355B"/>
           <w:sz w:val="19"/>
         </w:rPr>
         <w:t>Exclusionary screening (companies)</w:t>
@@ -4144,7 +5299,7 @@
             <w:r>
               <w:rPr>
                 <w:b/>
-                <w:color w:val="1A1A1A"/>
+                <w:color w:val="1B2430"/>
                 <w:sz w:val="19"/>
               </w:rPr>
               <w:t>Yes, the company is not involved in excluded sectors: controversial and nuclear weapons, tobacco, gambling and restricted sectors in fossil fuel</w:t>
@@ -4161,7 +5316,7 @@
             <w:r>
               <w:rPr>
                 <w:b w:val="0"/>
-                <w:color w:val="5F6B7A"/>
+                <w:color w:val="667085"/>
                 <w:sz w:val="18"/>
               </w:rPr>
               <w:t>•</w:t>
@@ -4264,7 +5419,7 @@
             <w:r>
               <w:rPr>
                 <w:b/>
-                <w:color w:val="1A1A1A"/>
+                <w:color w:val="1B2430"/>
                 <w:sz w:val="19"/>
               </w:rPr>
               <w:t>Yes, the company does not have red flag/signal related to controversies based on UN Global Compact, OECD Guidelines for Multinational Enterprises or any other relevant principles/standards</w:t>
@@ -4281,7 +5436,7 @@
             <w:r>
               <w:rPr>
                 <w:b w:val="0"/>
-                <w:color w:val="5F6B7A"/>
+                <w:color w:val="667085"/>
                 <w:sz w:val="18"/>
               </w:rPr>
               <w:t>•</w:t>
@@ -4366,7 +5521,7 @@
             <w:r>
               <w:rPr>
                 <w:b/>
-                <w:color w:val="1A1A1A"/>
+                <w:color w:val="1B2430"/>
                 <w:sz w:val="19"/>
               </w:rPr>
               <w:t>Yes, the company is not in the list of sanctions (add a screenshot)</w:t>
@@ -4383,7 +5538,7 @@
             <w:r>
               <w:rPr>
                 <w:b w:val="0"/>
-                <w:color w:val="5F6B7A"/>
+                <w:color w:val="667085"/>
                 <w:sz w:val="18"/>
               </w:rPr>
               <w:t>•</w:t>
@@ -4468,7 +5623,7 @@
             <w:r>
               <w:rPr>
                 <w:b/>
-                <w:color w:val="1A1A1A"/>
+                <w:color w:val="1B2430"/>
                 <w:sz w:val="19"/>
               </w:rPr>
               <w:t>Yes, issues were not identified from adverse media checks (add a screenshot)</w:t>
@@ -4485,7 +5640,7 @@
             <w:r>
               <w:rPr>
                 <w:b w:val="0"/>
-                <w:color w:val="5F6B7A"/>
+                <w:color w:val="667085"/>
                 <w:sz w:val="18"/>
               </w:rPr>
               <w:t>•</w:t>
@@ -4511,7 +5666,7 @@
             <w:r>
               <w:rPr>
                 <w:b w:val="0"/>
-                <w:color w:val="5F6B7A"/>
+                <w:color w:val="667085"/>
                 <w:sz w:val="18"/>
               </w:rPr>
               <w:t>•</w:t>
@@ -4557,7 +5712,7 @@
     <w:p>
       <w:pPr>
         <w:keepNext/>
-        <w:shd w:val="clear" w:color="auto" w:fill="EAF1F8"/>
+        <w:shd w:val="clear" w:color="auto" w:fill="EEF3F8"/>
         <w:spacing w:before="200" w:after="80"/>
         <w:ind w:left="85"/>
       </w:pPr>
@@ -4565,7 +5720,7 @@
         <w:rPr>
           <w:b/>
           <w:caps/>
-          <w:color w:val="1F4E79"/>
+          <w:color w:val="12355B"/>
           <w:sz w:val="19"/>
         </w:rPr>
         <w:t>ESG integration and positive screening (positive answers imply higher allocation)</w:t>
@@ -4638,7 +5793,7 @@
             <w:r>
               <w:rPr>
                 <w:b/>
-                <w:color w:val="1A1A1A"/>
+                <w:color w:val="1B2430"/>
                 <w:sz w:val="19"/>
               </w:rPr>
               <w:t>Yes, the company is promoting environmental or social characteristics (activities, ESG policy, good ESG rating, etc)</w:t>
@@ -4655,7 +5810,7 @@
             <w:r>
               <w:rPr>
                 <w:b w:val="0"/>
-                <w:color w:val="5F6B7A"/>
+                <w:color w:val="667085"/>
                 <w:sz w:val="18"/>
               </w:rPr>
               <w:t>•</w:t>
@@ -4758,7 +5913,7 @@
             <w:r>
               <w:rPr>
                 <w:b/>
-                <w:color w:val="1A1A1A"/>
+                <w:color w:val="1B2430"/>
                 <w:sz w:val="19"/>
               </w:rPr>
               <w:t>Yes, the activities of the company or it’s strategy is aligned with the taxonomy and/or Paris agreement targets (e.g. net zero commitment)</w:t>
@@ -4775,7 +5930,7 @@
             <w:r>
               <w:rPr>
                 <w:b w:val="0"/>
-                <w:color w:val="5F6B7A"/>
+                <w:color w:val="667085"/>
                 <w:sz w:val="18"/>
               </w:rPr>
               <w:t>•</w:t>
@@ -4878,7 +6033,7 @@
             <w:r>
               <w:rPr>
                 <w:b/>
-                <w:color w:val="1A1A1A"/>
+                <w:color w:val="1B2430"/>
                 <w:sz w:val="19"/>
               </w:rPr>
               <w:t>Yes, the company does not have yellow flag/signal related to controversies based on UN Global Compact or any other relevant principles/standards</w:t>
@@ -4895,7 +6050,7 @@
             <w:r>
               <w:rPr>
                 <w:b w:val="0"/>
-                <w:color w:val="5F6B7A"/>
+                <w:color w:val="667085"/>
                 <w:sz w:val="18"/>
               </w:rPr>
               <w:t>•</w:t>
@@ -4921,7 +6076,7 @@
             <w:r>
               <w:rPr>
                 <w:b w:val="0"/>
-                <w:color w:val="5F6B7A"/>
+                <w:color w:val="667085"/>
                 <w:sz w:val="18"/>
               </w:rPr>
               <w:t>•</w:t>
@@ -5006,7 +6161,7 @@
             <w:r>
               <w:rPr>
                 <w:b/>
-                <w:color w:val="1A1A1A"/>
+                <w:color w:val="1B2430"/>
                 <w:sz w:val="19"/>
               </w:rPr>
               <w:t>Yes, the company fulfills the expectations from SEB thematic and sector policies</w:t>
@@ -5036,7 +6191,7 @@
             <w:r>
               <w:rPr>
                 <w:b w:val="0"/>
-                <w:color w:val="5F6B7A"/>
+                <w:color w:val="667085"/>
                 <w:sz w:val="18"/>
               </w:rPr>
               <w:t>•</w:t>
@@ -5050,14 +6205,14 @@
               </w:rPr>
               <w:t>The Electricity &amp; Renewable Energy policy</w:t>
             </w:r>
-            <w:hyperlink r:id="rId28">
+            <w:hyperlink r:id="rId30">
               <w:r>
                 <w:rPr>
                   <w:color w:val="2A78D6"/>
                   <w:vertAlign w:val="superscript"/>
                   <w:sz w:val="15"/>
                 </w:rPr>
-                <w:t xml:space="preserve">17</w:t>
+                <w:t xml:space="preserve">20</w:t>
               </w:r>
             </w:hyperlink>
             <w:r>
@@ -5093,7 +6248,7 @@
             <w:r>
               <w:rPr>
                 <w:b w:val="0"/>
-                <w:color w:val="5F6B7A"/>
+                <w:color w:val="667085"/>
                 <w:sz w:val="18"/>
               </w:rPr>
               <w:t>•</w:t>
@@ -5119,7 +6274,7 @@
             <w:r>
               <w:rPr>
                 <w:b w:val="0"/>
-                <w:color w:val="5F6B7A"/>
+                <w:color w:val="667085"/>
                 <w:sz w:val="18"/>
               </w:rPr>
               <w:t>•</w:t>
@@ -5170,7 +6325,7 @@
     <w:p>
       <w:pPr>
         <w:keepNext/>
-        <w:shd w:val="clear" w:color="auto" w:fill="EAF1F8"/>
+        <w:shd w:val="clear" w:color="auto" w:fill="EEF3F8"/>
         <w:spacing w:before="200" w:after="80"/>
         <w:ind w:left="85"/>
       </w:pPr>
@@ -5178,7 +6333,7 @@
         <w:rPr>
           <w:b/>
           <w:caps/>
-          <w:color w:val="1F4E79"/>
+          <w:color w:val="12355B"/>
           <w:sz w:val="19"/>
         </w:rPr>
         <w:t>Engagement</w:t>
@@ -5251,7 +6406,7 @@
             <w:r>
               <w:rPr>
                 <w:b/>
-                <w:color w:val="1A1A1A"/>
+                <w:color w:val="1B2430"/>
                 <w:sz w:val="19"/>
               </w:rPr>
               <w:t>Is there a need for pro-active engagement with the company?</w:t>
@@ -5268,7 +6423,7 @@
             <w:r>
               <w:rPr>
                 <w:b w:val="0"/>
-                <w:color w:val="5F6B7A"/>
+                <w:color w:val="667085"/>
                 <w:sz w:val="18"/>
               </w:rPr>
               <w:t>•</w:t>
@@ -5301,7 +6456,7 @@
     <w:p>
       <w:pPr>
         <w:keepNext/>
-        <w:shd w:val="clear" w:color="auto" w:fill="EAF1F8"/>
+        <w:shd w:val="clear" w:color="auto" w:fill="EEF3F8"/>
         <w:spacing w:before="200" w:after="80"/>
         <w:ind w:left="85"/>
       </w:pPr>
@@ -5309,7 +6464,7 @@
         <w:rPr>
           <w:b/>
           <w:caps/>
-          <w:color w:val="1F4E79"/>
+          <w:color w:val="12355B"/>
           <w:sz w:val="19"/>
         </w:rPr>
         <w:t>Indicators</w:t>
@@ -5382,7 +6537,7 @@
             <w:r>
               <w:rPr>
                 <w:b/>
-                <w:color w:val="1A1A1A"/>
+                <w:color w:val="1B2430"/>
                 <w:sz w:val="19"/>
               </w:rPr>
               <w:t>Yes, the indicators of the company support the targets of sustainability and PAI indicators followed by the Fund</w:t>
@@ -5399,7 +6554,7 @@
             <w:r>
               <w:rPr>
                 <w:b w:val="0"/>
-                <w:color w:val="5F6B7A"/>
+                <w:color w:val="667085"/>
                 <w:sz w:val="18"/>
               </w:rPr>
               <w:t>•</w:t>
@@ -5473,7 +6628,7 @@
       <w:r>
         <w:rPr>
           <w:b w:val="0"/>
-          <w:color w:val="5F6B7A"/>
+          <w:color w:val="667085"/>
           <w:sz w:val="16"/>
         </w:rPr>
         <w:t>SEB policies applied: Policy on Sustainability Considerations in Investments (SEB AB); Electricity &amp; Renewable Energy sector policy; Environmental Policy on Climate, Nature and Water (thematic); Social and Human Rights Policy (thematic); Governance expectations in sector policies (anti-corruption, tax, reporting)</w:t>
@@ -5483,7 +6638,7 @@
       <w:pPr>
         <w:keepNext/>
         <w:pBdr>
-          <w:bottom w:val="single" w:sz="8" w:color="1F4E79" w:space="4"/>
+          <w:bottom w:val="single" w:sz="8" w:color="12355B" w:space="4"/>
         </w:pBdr>
         <w:tabs>
           <w:tab w:pos="482" w:val="left"/>
@@ -5502,7 +6657,7 @@
       <w:r>
         <w:rPr>
           <w:b/>
-          <w:color w:val="1F4E79"/>
+          <w:color w:val="12355B"/>
           <w:sz w:val="28"/>
         </w:rPr>
         <w:t>Sources</w:t>
@@ -5519,7 +6674,7 @@
       <w:r>
         <w:rPr>
           <w:b w:val="0"/>
-          <w:color w:val="5F6B7A"/>
+          <w:color w:val="667085"/>
           <w:sz w:val="17"/>
         </w:rPr>
         <w:t>1.</w:t>
@@ -5546,7 +6701,7 @@
       <w:r>
         <w:rPr>
           <w:b w:val="0"/>
-          <w:color w:val="5F6B7A"/>
+          <w:color w:val="667085"/>
           <w:sz w:val="17"/>
         </w:rPr>
         <w:t>2.</w:t>
@@ -5573,7 +6728,7 @@
       <w:r>
         <w:rPr>
           <w:b w:val="0"/>
-          <w:color w:val="5F6B7A"/>
+          <w:color w:val="667085"/>
           <w:sz w:val="17"/>
         </w:rPr>
         <w:t>3.</w:t>
@@ -5600,7 +6755,7 @@
       <w:r>
         <w:rPr>
           <w:b w:val="0"/>
-          <w:color w:val="5F6B7A"/>
+          <w:color w:val="667085"/>
           <w:sz w:val="17"/>
         </w:rPr>
         <w:t>4.</w:t>
@@ -5627,7 +6782,7 @@
       <w:r>
         <w:rPr>
           <w:b w:val="0"/>
-          <w:color w:val="5F6B7A"/>
+          <w:color w:val="667085"/>
           <w:sz w:val="17"/>
         </w:rPr>
         <w:t>5.</w:t>
@@ -5654,7 +6809,7 @@
       <w:r>
         <w:rPr>
           <w:b w:val="0"/>
-          <w:color w:val="5F6B7A"/>
+          <w:color w:val="667085"/>
           <w:sz w:val="17"/>
         </w:rPr>
         <w:t>6.</w:t>
@@ -5681,7 +6836,7 @@
       <w:r>
         <w:rPr>
           <w:b w:val="0"/>
-          <w:color w:val="5F6B7A"/>
+          <w:color w:val="667085"/>
           <w:sz w:val="17"/>
         </w:rPr>
         <w:t>7.</w:t>
@@ -5708,7 +6863,7 @@
       <w:r>
         <w:rPr>
           <w:b w:val="0"/>
-          <w:color w:val="5F6B7A"/>
+          <w:color w:val="667085"/>
           <w:sz w:val="17"/>
         </w:rPr>
         <w:t>8.</w:t>
@@ -5735,7 +6890,7 @@
       <w:r>
         <w:rPr>
           <w:b w:val="0"/>
-          <w:color w:val="5F6B7A"/>
+          <w:color w:val="667085"/>
           <w:sz w:val="17"/>
         </w:rPr>
         <w:t>9.</w:t>
@@ -5762,7 +6917,7 @@
       <w:r>
         <w:rPr>
           <w:b w:val="0"/>
-          <w:color w:val="5F6B7A"/>
+          <w:color w:val="667085"/>
           <w:sz w:val="17"/>
         </w:rPr>
         <w:t>10.</w:t>
@@ -5789,7 +6944,7 @@
       <w:r>
         <w:rPr>
           <w:b w:val="0"/>
-          <w:color w:val="5F6B7A"/>
+          <w:color w:val="667085"/>
           <w:sz w:val="17"/>
         </w:rPr>
         <w:t>11.</w:t>
@@ -5816,7 +6971,7 @@
       <w:r>
         <w:rPr>
           <w:b w:val="0"/>
-          <w:color w:val="5F6B7A"/>
+          <w:color w:val="667085"/>
           <w:sz w:val="17"/>
         </w:rPr>
         <w:t>12.</w:t>
@@ -5843,7 +6998,7 @@
       <w:r>
         <w:rPr>
           <w:b w:val="0"/>
-          <w:color w:val="5F6B7A"/>
+          <w:color w:val="667085"/>
           <w:sz w:val="17"/>
         </w:rPr>
         <w:t>13.</w:t>
@@ -5870,7 +7025,7 @@
       <w:r>
         <w:rPr>
           <w:b w:val="0"/>
-          <w:color w:val="5F6B7A"/>
+          <w:color w:val="667085"/>
           <w:sz w:val="17"/>
         </w:rPr>
         <w:t>14.</w:t>
@@ -5897,7 +7052,7 @@
       <w:r>
         <w:rPr>
           <w:b w:val="0"/>
-          <w:color w:val="5F6B7A"/>
+          <w:color w:val="667085"/>
           <w:sz w:val="17"/>
         </w:rPr>
         <w:t>15.</w:t>
@@ -5924,7 +7079,7 @@
       <w:r>
         <w:rPr>
           <w:b w:val="0"/>
-          <w:color w:val="5F6B7A"/>
+          <w:color w:val="667085"/>
           <w:sz w:val="17"/>
         </w:rPr>
         <w:t>16.</w:t>
@@ -5951,13 +7106,94 @@
       <w:r>
         <w:rPr>
           <w:b w:val="0"/>
-          <w:color w:val="5F6B7A"/>
+          <w:color w:val="667085"/>
           <w:sz w:val="17"/>
         </w:rPr>
         <w:t>17.</w:t>
         <w:tab/>
       </w:r>
+      <w:hyperlink r:id="rId16">
+        <w:r>
+          <w:rPr>
+            <w:color w:val="2A78D6"/>
+            <w:sz w:val="17"/>
+          </w:rPr>
+          <w:t xml:space="preserve">AEI - Interim financial statements 6M 2026 (unaudited, IFRS), p. 4, 14, 2026</w:t>
+        </w:r>
+      </w:hyperlink>
+    </w:p>
+    <w:p>
+      <w:pPr>
+        <w:tabs>
+          <w:tab w:pos="397" w:val="left"/>
+        </w:tabs>
+        <w:spacing w:before="0" w:after="30"/>
+        <w:ind w:left="397" w:hanging="397"/>
+      </w:pPr>
+      <w:r>
+        <w:rPr>
+          <w:b w:val="0"/>
+          <w:color w:val="667085"/>
+          <w:sz w:val="17"/>
+        </w:rPr>
+        <w:t>18.</w:t>
+        <w:tab/>
+      </w:r>
+      <w:hyperlink r:id="rId27">
+        <w:r>
+          <w:rPr>
+            <w:color w:val="2A78D6"/>
+            <w:sz w:val="17"/>
+          </w:rPr>
+          <w:t xml:space="preserve">AEI - Interim financial statements 6M 2026 (unaudited, IFRS), p. 18, 2026</w:t>
+        </w:r>
+      </w:hyperlink>
+    </w:p>
+    <w:p>
+      <w:pPr>
+        <w:tabs>
+          <w:tab w:pos="397" w:val="left"/>
+        </w:tabs>
+        <w:spacing w:before="0" w:after="30"/>
+        <w:ind w:left="397" w:hanging="397"/>
+      </w:pPr>
+      <w:r>
+        <w:rPr>
+          <w:b w:val="0"/>
+          <w:color w:val="667085"/>
+          <w:sz w:val="17"/>
+        </w:rPr>
+        <w:t>19.</w:t>
+        <w:tab/>
+      </w:r>
       <w:hyperlink r:id="rId28">
+        <w:r>
+          <w:rPr>
+            <w:color w:val="2A78D6"/>
+            <w:sz w:val="17"/>
+          </w:rPr>
+          <w:t xml:space="preserve">AEI - Investor factsheet as of 2026-06-30, p. 2, 2026</w:t>
+        </w:r>
+      </w:hyperlink>
+    </w:p>
+    <w:p>
+      <w:pPr>
+        <w:tabs>
+          <w:tab w:pos="397" w:val="left"/>
+        </w:tabs>
+        <w:spacing w:before="0" w:after="30"/>
+        <w:ind w:left="397" w:hanging="397"/>
+      </w:pPr>
+      <w:r>
+        <w:rPr>
+          <w:b w:val="0"/>
+          <w:color w:val="667085"/>
+          <w:sz w:val="17"/>
+        </w:rPr>
+        <w:t>20.</w:t>
+        <w:tab/>
+      </w:r>
+      <w:hyperlink r:id="rId30">
         <w:r>
           <w:rPr>
             <w:color w:val="2A78D6"/>
@@ -5974,7 +7210,7 @@
       <w:r>
         <w:rPr>
           <w:b w:val="0"/>
-          <w:color w:val="5F6B7A"/>
+          <w:color w:val="667085"/>
           <w:sz w:val="16"/>
         </w:rPr>
         <w:t>Report prepared from public sources. Figures are as published by the issuer; small numbers next to the text point to the source list.</w:t>
@@ -5999,7 +7235,7 @@
   <w:p>
     <w:pPr>
       <w:pBdr>
-        <w:top w:val="single" w:sz="4" w:color="C9D3DE" w:space="4"/>
+        <w:top w:val="single" w:sz="4" w:color="D5DCE4" w:space="4"/>
       </w:pBdr>
       <w:tabs>
         <w:tab w:pos="9638" w:val="right"/>
@@ -6008,7 +7244,7 @@
     <w:r>
       <w:rPr>
         <w:b w:val="0"/>
-        <w:color w:val="5F6B7A"/>
+        <w:color w:val="667085"/>
         <w:sz w:val="16"/>
       </w:rPr>
       <w:t>Atsinaujinančios energetikos investicijos (AEI) · 6M2026 · 2026-10-22</w:t>
@@ -6017,7 +7253,7 @@
     <w:r>
       <w:rPr>
         <w:b/>
-        <w:color w:val="1F4E79"/>
+        <w:color w:val="12355B"/>
         <w:sz w:val="16"/>
       </w:rPr>
       <w:fldChar w:fldCharType="begin"/>
@@ -6033,7 +7269,7 @@
   <w:p>
     <w:pPr>
       <w:pBdr>
-        <w:top w:val="single" w:sz="4" w:color="C9D3DE" w:space="4"/>
+        <w:top w:val="single" w:sz="4" w:color="D5DCE4" w:space="4"/>
       </w:pBdr>
       <w:tabs>
         <w:tab w:pos="9638" w:val="right"/>
@@ -6042,7 +7278,7 @@
     <w:r>
       <w:rPr>
         <w:b w:val="0"/>
-        <w:color w:val="5F6B7A"/>
+        <w:color w:val="667085"/>
         <w:sz w:val="16"/>
       </w:rPr>
       <w:t>Atsinaujinančios energetikos investicijos (AEI) · 6M2026 · 2026-10-22</w:t>
@@ -6051,7 +7287,7 @@
     <w:r>
       <w:rPr>
         <w:b/>
-        <w:color w:val="1F4E79"/>
+        <w:color w:val="12355B"/>
         <w:sz w:val="16"/>
       </w:rPr>
       <w:fldChar w:fldCharType="begin"/>
@@ -6067,7 +7303,7 @@
   <w:p>
     <w:pPr>
       <w:pBdr>
-        <w:bottom w:val="single" w:sz="4" w:color="C9D3DE" w:space="4"/>
+        <w:bottom w:val="single" w:sz="4" w:color="D5DCE4" w:space="4"/>
       </w:pBdr>
       <w:tabs>
         <w:tab w:pos="9638" w:val="right"/>
@@ -6076,7 +7312,7 @@
     <w:r>
       <w:rPr>
         <w:b/>
-        <w:color w:val="1F4E79"/>
+        <w:color w:val="12355B"/>
         <w:sz w:val="16"/>
       </w:rPr>
       <w:t>Atsinaujinančios energetikos investicijos (AEI)</w:t>
@@ -6084,7 +7320,7 @@
     <w:r>
       <w:rPr>
         <w:b w:val="0"/>
-        <w:color w:val="5F6B7A"/>
+        <w:color w:val="667085"/>
         <w:sz w:val="16"/>
       </w:rPr>
       <w:tab/>
@@ -6462,7 +7698,7 @@
     </w:pPr>
     <w:rPr>
       <w:rFonts w:ascii="Calibri" w:hAnsi="Calibri" w:eastAsia="Calibri"/>
-      <w:color w:val="1A1A1A"/>
+      <w:color w:val="1B2430"/>
       <w:sz w:val="21"/>
     </w:rPr>
   </w:style>

</xml_diff>

<commit_message>
Green bonds (leaf, filter, CSV, reports), report readiness cards, email draft page
Co-Authored-By: Claude Opus 5.5 (1M context) <noreply@anthropic.com>
Claude-Session: https://claude.ai/code/session_013ZCssjCF43KM8LCnCdqfwt
</commit_message>
<xml_diff>
--- a/docs/files/aei/aei_6M2026_en.docx
+++ b/docs/files/aei/aei_6M2026_en.docx
@@ -300,6 +300,49 @@
               </w:rPr>
               <w:t>AEI 8.00% green bonds 2025/2027</w:t>
             </w:r>
+            <w:r>
+              <w:t xml:space="preserve"> </w:t>
+              <w:drawing>
+                <wp:inline xmlns:a="http://schemas.openxmlformats.org/drawingml/2006/main" xmlns:pic="http://schemas.openxmlformats.org/drawingml/2006/picture">
+                  <wp:extent cx="91757" cy="91757"/>
+                  <wp:docPr id="1" name="Picture 1"/>
+                  <wp:cNvGraphicFramePr>
+                    <a:graphicFrameLocks noChangeAspect="1"/>
+                  </wp:cNvGraphicFramePr>
+                  <a:graphic>
+                    <a:graphicData uri="http://schemas.openxmlformats.org/drawingml/2006/picture">
+                      <pic:pic>
+                        <pic:nvPicPr>
+                          <pic:cNvPr id="0" name="leaf.png"/>
+                          <pic:cNvPicPr/>
+                        </pic:nvPicPr>
+                        <pic:blipFill>
+                          <a:blip r:embed="rId12"/>
+                          <a:stretch>
+                            <a:fillRect/>
+                          </a:stretch>
+                        </pic:blipFill>
+                        <pic:spPr>
+                          <a:xfrm>
+                            <a:off x="0" y="0"/>
+                            <a:ext cx="91757" cy="91757"/>
+                          </a:xfrm>
+                          <a:prstGeom prst="rect"/>
+                        </pic:spPr>
+                      </pic:pic>
+                    </a:graphicData>
+                  </a:graphic>
+                </wp:inline>
+              </w:drawing>
+            </w:r>
+            <w:r>
+              <w:rPr>
+                <w:b/>
+                <w:color w:val="1B7F3B"/>
+                <w:sz w:val="14"/>
+              </w:rPr>
+              <w:t xml:space="preserve"> Green bond</w:t>
+            </w:r>
           </w:p>
           <w:p>
             <w:pPr>
@@ -390,7 +433,7 @@
               </w:rPr>
               <w:t xml:space="preserve"> AEI itself states that current liabilities exceed current assets and EUR 24.7m of bonds must be repaid on 2026-12-04; it has started selling projects to raise funds</w:t>
             </w:r>
-            <w:hyperlink r:id="rId12">
+            <w:hyperlink r:id="rId13">
               <w:r>
                 <w:rPr>
                   <w:color w:val="2A78D6"/>
@@ -408,7 +451,7 @@
               </w:rPr>
               <w:t>. Covenants were met at 2026-06-30, with an equity ratio of 54.5% (floor 50%)</w:t>
             </w:r>
-            <w:hyperlink r:id="rId13">
+            <w:hyperlink r:id="rId14">
               <w:r>
                 <w:rPr>
                   <w:color w:val="2A78D6"/>
@@ -801,7 +844,7 @@
         </w:rPr>
         <w:t xml:space="preserve"> 8.5% bonds of EUR 24.7m are due on 2026-12-04; current liabilities exceed current assets; the report discloses a material uncertainty about going concern</w:t>
       </w:r>
-      <w:hyperlink r:id="rId12">
+      <w:hyperlink r:id="rId13">
         <w:r>
           <w:rPr>
             <w:color w:val="2A78D6"/>
@@ -847,7 +890,7 @@
         </w:rPr>
         <w:t xml:space="preserve"> sell-side advisers hired and talks with buyers under way; on 2026-06-30 Zala Elektriba SIA was moved to UAB Sorlena (transaction value EUR 24.0m)</w:t>
       </w:r>
-      <w:hyperlink r:id="rId14">
+      <w:hyperlink r:id="rId15">
         <w:r>
           <w:rPr>
             <w:color w:val="2A78D6"/>
@@ -864,7 +907,7 @@
         </w:rPr>
         <w:t>,</w:t>
       </w:r>
-      <w:hyperlink r:id="rId15">
+      <w:hyperlink r:id="rId16">
         <w:r>
           <w:rPr>
             <w:color w:val="2A78D6"/>
@@ -910,7 +953,7 @@
         </w:rPr>
         <w:t xml:space="preserve"> 1H net loss EUR 5.1m (4.1m a year earlier); FY2025 EUR 11.7m</w:t>
       </w:r>
-      <w:hyperlink r:id="rId16">
+      <w:hyperlink r:id="rId17">
         <w:r>
           <w:rPr>
             <w:color w:val="2A78D6"/>
@@ -927,7 +970,7 @@
         </w:rPr>
         <w:t>,</w:t>
       </w:r>
-      <w:hyperlink r:id="rId17">
+      <w:hyperlink r:id="rId18">
         <w:r>
           <w:rPr>
             <w:color w:val="2A78D6"/>
@@ -973,7 +1016,7 @@
         </w:rPr>
         <w:t xml:space="preserve"> net debt EUR 63.5m (76.1m at end-2025); the 2021-2026 bond (EUR 20.7m) was fully redeemed on 2026-06-17</w:t>
       </w:r>
-      <w:hyperlink r:id="rId18">
+      <w:hyperlink r:id="rId19">
         <w:r>
           <w:rPr>
             <w:color w:val="2A78D6"/>
@@ -990,7 +1033,7 @@
         </w:rPr>
         <w:t>,</w:t>
       </w:r>
-      <w:hyperlink r:id="rId19">
+      <w:hyperlink r:id="rId20">
         <w:r>
           <w:rPr>
             <w:color w:val="2A78D6"/>
@@ -1007,7 +1050,7 @@
         </w:rPr>
         <w:t>,</w:t>
       </w:r>
-      <w:hyperlink r:id="rId15">
+      <w:hyperlink r:id="rId16">
         <w:r>
           <w:rPr>
             <w:color w:val="2A78D6"/>
@@ -1279,6 +1322,49 @@
               </w:rPr>
               <w:t>AEI 8.00% green bonds 2025/2027</w:t>
             </w:r>
+            <w:r>
+              <w:t xml:space="preserve"> </w:t>
+              <w:drawing>
+                <wp:inline xmlns:a="http://schemas.openxmlformats.org/drawingml/2006/main" xmlns:pic="http://schemas.openxmlformats.org/drawingml/2006/picture">
+                  <wp:extent cx="91757" cy="91757"/>
+                  <wp:docPr id="2" name="Picture 2"/>
+                  <wp:cNvGraphicFramePr>
+                    <a:graphicFrameLocks noChangeAspect="1"/>
+                  </wp:cNvGraphicFramePr>
+                  <a:graphic>
+                    <a:graphicData uri="http://schemas.openxmlformats.org/drawingml/2006/picture">
+                      <pic:pic>
+                        <pic:nvPicPr>
+                          <pic:cNvPr id="0" name="leaf.png"/>
+                          <pic:cNvPicPr/>
+                        </pic:nvPicPr>
+                        <pic:blipFill>
+                          <a:blip r:embed="rId12"/>
+                          <a:stretch>
+                            <a:fillRect/>
+                          </a:stretch>
+                        </pic:blipFill>
+                        <pic:spPr>
+                          <a:xfrm>
+                            <a:off x="0" y="0"/>
+                            <a:ext cx="91757" cy="91757"/>
+                          </a:xfrm>
+                          <a:prstGeom prst="rect"/>
+                        </pic:spPr>
+                      </pic:pic>
+                    </a:graphicData>
+                  </a:graphic>
+                </wp:inline>
+              </w:drawing>
+            </w:r>
+            <w:r>
+              <w:rPr>
+                <w:b/>
+                <w:color w:val="1B7F3B"/>
+                <w:sz w:val="14"/>
+              </w:rPr>
+              <w:t xml:space="preserve"> Green bond</w:t>
+            </w:r>
           </w:p>
         </w:tc>
         <w:tc>
@@ -1590,7 +1676,7 @@
               </w:rPr>
               <w:t>Total operating income, EUR m</w:t>
             </w:r>
-            <w:hyperlink r:id="rId17">
+            <w:hyperlink r:id="rId18">
               <w:r>
                 <w:rPr>
                   <w:color w:val="2A78D6"/>
@@ -1607,7 +1693,7 @@
               </w:rPr>
               <w:t>,</w:t>
             </w:r>
-            <w:hyperlink r:id="rId16">
+            <w:hyperlink r:id="rId17">
               <w:r>
                 <w:rPr>
                   <w:color w:val="2A78D6"/>
@@ -1739,7 +1825,7 @@
               </w:rPr>
               <w:t>Net profit, EUR m</w:t>
             </w:r>
-            <w:hyperlink r:id="rId17">
+            <w:hyperlink r:id="rId18">
               <w:r>
                 <w:rPr>
                   <w:color w:val="2A78D6"/>
@@ -1756,7 +1842,7 @@
               </w:rPr>
               <w:t>,</w:t>
             </w:r>
-            <w:hyperlink r:id="rId16">
+            <w:hyperlink r:id="rId17">
               <w:r>
                 <w:rPr>
                   <w:color w:val="2A78D6"/>
@@ -1888,7 +1974,7 @@
               </w:rPr>
               <w:t>Total assets, EUR m</w:t>
             </w:r>
-            <w:hyperlink r:id="rId20">
+            <w:hyperlink r:id="rId21">
               <w:r>
                 <w:rPr>
                   <w:color w:val="2A78D6"/>
@@ -1905,7 +1991,7 @@
               </w:rPr>
               <w:t>,</w:t>
             </w:r>
-            <w:hyperlink r:id="rId21">
+            <w:hyperlink r:id="rId22">
               <w:r>
                 <w:rPr>
                   <w:color w:val="2A78D6"/>
@@ -2037,7 +2123,7 @@
               </w:rPr>
               <w:t>Equity, EUR m</w:t>
             </w:r>
-            <w:hyperlink r:id="rId20">
+            <w:hyperlink r:id="rId21">
               <w:r>
                 <w:rPr>
                   <w:color w:val="2A78D6"/>
@@ -2054,7 +2140,7 @@
               </w:rPr>
               <w:t>,</w:t>
             </w:r>
-            <w:hyperlink r:id="rId21">
+            <w:hyperlink r:id="rId22">
               <w:r>
                 <w:rPr>
                   <w:color w:val="2A78D6"/>
@@ -2186,7 +2272,7 @@
               </w:rPr>
               <w:t>Equity ratio</w:t>
             </w:r>
-            <w:hyperlink r:id="rId20">
+            <w:hyperlink r:id="rId21">
               <w:r>
                 <w:rPr>
                   <w:color w:val="2A78D6"/>
@@ -2203,7 +2289,7 @@
               </w:rPr>
               <w:t>,</w:t>
             </w:r>
-            <w:hyperlink r:id="rId21">
+            <w:hyperlink r:id="rId22">
               <w:r>
                 <w:rPr>
                   <w:color w:val="2A78D6"/>
@@ -2336,7 +2422,7 @@
               </w:rPr>
               <w:t>Net debt, EUR m</w:t>
             </w:r>
-            <w:hyperlink r:id="rId20">
+            <w:hyperlink r:id="rId21">
               <w:r>
                 <w:rPr>
                   <w:color w:val="2A78D6"/>
@@ -2353,7 +2439,7 @@
               </w:rPr>
               <w:t>,</w:t>
             </w:r>
-            <w:hyperlink r:id="rId19">
+            <w:hyperlink r:id="rId20">
               <w:r>
                 <w:rPr>
                   <w:color w:val="2A78D6"/>
@@ -2370,7 +2456,7 @@
               </w:rPr>
               <w:t>,</w:t>
             </w:r>
-            <w:hyperlink r:id="rId18">
+            <w:hyperlink r:id="rId19">
               <w:r>
                 <w:rPr>
                   <w:color w:val="2A78D6"/>
@@ -2502,7 +2588,7 @@
               </w:rPr>
               <w:t>Installed green capacity, MW</w:t>
             </w:r>
-            <w:hyperlink r:id="rId15">
+            <w:hyperlink r:id="rId16">
               <w:r>
                 <w:rPr>
                   <w:color w:val="2A78D6"/>
@@ -2649,7 +2735,7 @@
         <w:drawing>
           <wp:inline xmlns:a="http://schemas.openxmlformats.org/drawingml/2006/main" xmlns:pic="http://schemas.openxmlformats.org/drawingml/2006/picture">
             <wp:extent cx="6120000" cy="2231199"/>
-            <wp:docPr id="1" name="Picture 1"/>
+            <wp:docPr id="3" name="Picture 3"/>
             <wp:cNvGraphicFramePr>
               <a:graphicFrameLocks noChangeAspect="1"/>
             </wp:cNvGraphicFramePr>
@@ -2661,7 +2747,7 @@
                     <pic:cNvPicPr/>
                   </pic:nvPicPr>
                   <pic:blipFill>
-                    <a:blip r:embed="rId22"/>
+                    <a:blip r:embed="rId23"/>
                     <a:stretch>
                       <a:fillRect/>
                     </a:stretch>
@@ -2732,7 +2818,7 @@
         </w:rPr>
         <w:t>AEI is a closed-end investment company for informed investors managed by UAB LORDS LB Asset Management; its term has been extended to 2028-02-05</w:t>
       </w:r>
-      <w:hyperlink r:id="rId23">
+      <w:hyperlink r:id="rId24">
         <w:r>
           <w:rPr>
             <w:color w:val="2A78D6"/>
@@ -2778,7 +2864,7 @@
         </w:rPr>
         <w:t xml:space="preserve"> Žaliosios investicijos (25%, wind, LT) 185.5 MW, PL SUN (Poland, solar) 72.0 MW operating, PV Energy Projects (Poland, solar) 50.8 MW operating; 590 MW solar, 490 MW wind and 57 MW storage in development</w:t>
       </w:r>
-      <w:hyperlink r:id="rId15">
+      <w:hyperlink r:id="rId16">
         <w:r>
           <w:rPr>
             <w:color w:val="2A78D6"/>
@@ -2795,7 +2881,7 @@
         </w:rPr>
         <w:t>,</w:t>
       </w:r>
-      <w:hyperlink r:id="rId23">
+      <w:hyperlink r:id="rId24">
         <w:r>
           <w:rPr>
             <w:color w:val="2A78D6"/>
@@ -2841,7 +2927,7 @@
         </w:rPr>
         <w:t xml:space="preserve"> foundations done, turbine erection started</w:t>
       </w:r>
-      <w:hyperlink r:id="rId15">
+      <w:hyperlink r:id="rId16">
         <w:r>
           <w:rPr>
             <w:color w:val="2A78D6"/>
@@ -2910,7 +2996,7 @@
         </w:rPr>
         <w:t>At 2026-06-30 total assets EUR 153.6m, equity EUR 83.7m, liabilities EUR 69.9m; cash EUR 1.7m (excluding EUR 2.6m restricted)</w:t>
       </w:r>
-      <w:hyperlink r:id="rId21">
+      <w:hyperlink r:id="rId22">
         <w:r>
           <w:rPr>
             <w:color w:val="2A78D6"/>
@@ -2950,7 +3036,7 @@
         </w:rPr>
         <w:t>Bonds carrying amount EUR 59.0m, loans EUR 6.2m</w:t>
       </w:r>
-      <w:hyperlink r:id="rId18">
+      <w:hyperlink r:id="rId19">
         <w:r>
           <w:rPr>
             <w:color w:val="2A78D6"/>
@@ -2966,7 +3052,7 @@
         </w:rPr>
         <w:t>. There is no standard revenue line; 'total income' includes fair value changes</w:t>
       </w:r>
-      <w:hyperlink r:id="rId16">
+      <w:hyperlink r:id="rId17">
         <w:r>
           <w:rPr>
             <w:color w:val="2A78D6"/>
@@ -3012,7 +3098,7 @@
         </w:rPr>
         <w:t xml:space="preserve"> a favourable second-instance decision in June 2026, the rest with interest received in July 2026</w:t>
       </w:r>
-      <w:hyperlink r:id="rId24">
+      <w:hyperlink r:id="rId25">
         <w:r>
           <w:rPr>
             <w:color w:val="2A78D6"/>
@@ -3231,7 +3317,7 @@
               </w:rPr>
               <w:t>Fully redeemed on 2026-06-17 (EUR 20.7m), two days after the stated maturity</w:t>
             </w:r>
-            <w:hyperlink r:id="rId15">
+            <w:hyperlink r:id="rId16">
               <w:r>
                 <w:rPr>
                   <w:color w:val="2A78D6"/>
@@ -3248,7 +3334,7 @@
               </w:rPr>
               <w:t>,</w:t>
             </w:r>
-            <w:hyperlink r:id="rId13">
+            <w:hyperlink r:id="rId14">
               <w:r>
                 <w:rPr>
                   <w:color w:val="2A78D6"/>
@@ -3281,7 +3367,7 @@
               </w:rPr>
               <w:t>Redeemed</w:t>
             </w:r>
-            <w:hyperlink r:id="rId15">
+            <w:hyperlink r:id="rId16">
               <w:r>
                 <w:rPr>
                   <w:color w:val="2A78D6"/>
@@ -3370,7 +3456,7 @@
               </w:rPr>
               <w:t>Sale process started, no deals announced yet</w:t>
             </w:r>
-            <w:hyperlink r:id="rId12">
+            <w:hyperlink r:id="rId13">
               <w:r>
                 <w:rPr>
                   <w:color w:val="2A78D6"/>
@@ -3403,7 +3489,7 @@
               </w:rPr>
               <w:t>Awaiting the sales</w:t>
             </w:r>
-            <w:hyperlink r:id="rId25">
+            <w:hyperlink r:id="rId26">
               <w:r>
                 <w:rPr>
                   <w:color w:val="2A78D6"/>
@@ -3492,7 +3578,7 @@
               </w:rPr>
               <w:t>PL SUN 72.0 of 114 MW, PV Energy 50.8 of 67.7 MW; ~17 MW planned for December 2026</w:t>
             </w:r>
-            <w:hyperlink r:id="rId15">
+            <w:hyperlink r:id="rId16">
               <w:r>
                 <w:rPr>
                   <w:color w:val="2A78D6"/>
@@ -3509,7 +3595,7 @@
               </w:rPr>
               <w:t>,</w:t>
             </w:r>
-            <w:hyperlink r:id="rId26">
+            <w:hyperlink r:id="rId27">
               <w:r>
                 <w:rPr>
                   <w:color w:val="2A78D6"/>
@@ -3542,7 +3628,7 @@
               </w:rPr>
               <w:t>Construction ongoing</w:t>
             </w:r>
-            <w:hyperlink r:id="rId15">
+            <w:hyperlink r:id="rId16">
               <w:r>
                 <w:rPr>
                   <w:color w:val="2A78D6"/>
@@ -3631,7 +3717,7 @@
               </w:rPr>
               <w:t>Ownership transfer was expected by 2026-06-30; Nimela was still in the portfolio at end-June (EUR 3.35m)</w:t>
             </w:r>
-            <w:hyperlink r:id="rId26">
+            <w:hyperlink r:id="rId27">
               <w:r>
                 <w:rPr>
                   <w:color w:val="2A78D6"/>
@@ -3648,7 +3734,7 @@
               </w:rPr>
               <w:t>,</w:t>
             </w:r>
-            <w:hyperlink r:id="rId15">
+            <w:hyperlink r:id="rId16">
               <w:r>
                 <w:rPr>
                   <w:color w:val="2A78D6"/>
@@ -3681,7 +3767,7 @@
               </w:rPr>
               <w:t>Deadline passed, the deal is not complete</w:t>
             </w:r>
-            <w:hyperlink r:id="rId15">
+            <w:hyperlink r:id="rId16">
               <w:r>
                 <w:rPr>
                   <w:color w:val="2A78D6"/>
@@ -3789,7 +3875,7 @@
         </w:rPr>
         <w:t xml:space="preserve"> 8.00% green bonds LT0000134439, issued 2025-06-13, maturing 2027-12-13; outstanding EUR 32.7m</w:t>
       </w:r>
-      <w:hyperlink r:id="rId13">
+      <w:hyperlink r:id="rId14">
         <w:r>
           <w:rPr>
             <w:color w:val="2A78D6"/>
@@ -3805,7 +3891,7 @@
         </w:rPr>
         <w:t>. The 5% bond LT0000405938 was redeemed on 2026-06-17 and is no longer held</w:t>
       </w:r>
-      <w:hyperlink r:id="rId15">
+      <w:hyperlink r:id="rId16">
         <w:r>
           <w:rPr>
             <w:color w:val="2A78D6"/>
@@ -3851,7 +3937,7 @@
         </w:rPr>
         <w:t xml:space="preserve"> equity ratio ≥50% (54.5%, calculated by the tool), leverage ≤75%, minimum liquidity EUR 1.5m; met at 2026-06-30</w:t>
       </w:r>
-      <w:hyperlink r:id="rId13">
+      <w:hyperlink r:id="rId14">
         <w:r>
           <w:rPr>
             <w:color w:val="2A78D6"/>
@@ -3867,7 +3953,7 @@
         </w:rPr>
         <w:t>. At end-2025 the equity ratio was 50.8%, close to the floor</w:t>
       </w:r>
-      <w:hyperlink r:id="rId20">
+      <w:hyperlink r:id="rId21">
         <w:r>
           <w:rPr>
             <w:color w:val="2A78D6"/>
@@ -4002,7 +4088,7 @@
         </w:rPr>
         <w:t xml:space="preserve"> administrative expenses EUR 2.2m (1.9m), interest expenses EUR 3.7m (4.0m); investment assets fell to EUR 138.4m (165.0m) after EUR 27.7m of disposals and repayments</w:t>
       </w:r>
-      <w:hyperlink r:id="rId16">
+      <w:hyperlink r:id="rId17">
         <w:r>
           <w:rPr>
             <w:color w:val="2A78D6"/>
@@ -4048,7 +4134,7 @@
         </w:rPr>
         <w:t xml:space="preserve"> management says current electricity market conditions and demand support the projects' viability</w:t>
       </w:r>
-      <w:hyperlink r:id="rId27">
+      <w:hyperlink r:id="rId28">
         <w:r>
           <w:rPr>
             <w:color w:val="2A78D6"/>
@@ -4064,7 +4150,7 @@
         </w:rPr>
         <w:t>; in the mFRR balancing market Potentia Industriae earned EUR 1,356k and Rokvėja EUR 850k (to May)</w:t>
       </w:r>
-      <w:hyperlink r:id="rId28">
+      <w:hyperlink r:id="rId29">
         <w:r>
           <w:rPr>
             <w:color w:val="2A78D6"/>
@@ -4110,7 +4196,7 @@
         </w:rPr>
         <w:t xml:space="preserve"> the last solar projects (about 17 MW) are due to connect to the grid in December 2026</w:t>
       </w:r>
-      <w:hyperlink r:id="rId28">
+      <w:hyperlink r:id="rId29">
         <w:r>
           <w:rPr>
             <w:color w:val="2A78D6"/>
@@ -5068,7 +5154,7 @@
           <w:color w:val="667085"/>
           <w:sz w:val="18"/>
         </w:rPr>
-        <w:t>Automatic news scan (Google News, LT), 2026-07-24 – 2026-10-22: 1 articles.</w:t>
+        <w:t>Automatic news scan (Google News, LT), 2026-07-25 – 2026-10-23: 1 articles.</w:t>
       </w:r>
     </w:p>
     <w:tbl>
@@ -5160,7 +5246,7 @@
             <w:pPr>
               <w:spacing w:before="0" w:after="0"/>
             </w:pPr>
-            <w:hyperlink r:id="rId29">
+            <w:hyperlink r:id="rId30">
               <w:r>
                 <w:rPr>
                   <w:color w:val="1B2430"/>
@@ -5330,7 +5416,7 @@
               </w:rPr>
               <w:t>Solar, wind and storage projects only</w:t>
             </w:r>
-            <w:hyperlink r:id="rId15">
+            <w:hyperlink r:id="rId16">
               <w:r>
                 <w:rPr>
                   <w:color w:val="2A78D6"/>
@@ -5678,7 +5764,7 @@
                 <w:color w:val="333333"/>
                 <w:sz w:val="18"/>
               </w:rPr>
-              <w:t>News summary 2026-07-24 – 2026-10-22: 1 articles, 0 with an adverse keyword in the headline (details in the section "In the press").</w:t>
+              <w:t>News summary 2026-07-25 – 2026-10-23: 1 articles, 0 with an adverse keyword in the headline (details in the section "In the press").</w:t>
             </w:r>
           </w:p>
         </w:tc>
@@ -5824,7 +5910,7 @@
               </w:rPr>
               <w:t>A 'dark green' fund under SFDR Article 9 investing in renewable energy</w:t>
             </w:r>
-            <w:hyperlink r:id="rId15">
+            <w:hyperlink r:id="rId16">
               <w:r>
                 <w:rPr>
                   <w:color w:val="2A78D6"/>
@@ -5944,7 +6030,7 @@
               </w:rPr>
               <w:t>All bond issues are green bonds</w:t>
             </w:r>
-            <w:hyperlink r:id="rId13">
+            <w:hyperlink r:id="rId14">
               <w:r>
                 <w:rPr>
                   <w:color w:val="2A78D6"/>
@@ -6205,7 +6291,7 @@
               </w:rPr>
               <w:t>The Electricity &amp; Renewable Energy policy</w:t>
             </w:r>
-            <w:hyperlink r:id="rId30">
+            <w:hyperlink r:id="rId31">
               <w:r>
                 <w:rPr>
                   <w:color w:val="2A78D6"/>
@@ -6288,7 +6374,7 @@
               </w:rPr>
               <w:t>Ekoelektra has all building permits)</w:t>
             </w:r>
-            <w:hyperlink r:id="rId15">
+            <w:hyperlink r:id="rId16">
               <w:r>
                 <w:rPr>
                   <w:color w:val="2A78D6"/>
@@ -6568,7 +6654,7 @@
               </w:rPr>
               <w:t>Installed capacity (317.9 MW) and production are reported</w:t>
             </w:r>
-            <w:hyperlink r:id="rId15">
+            <w:hyperlink r:id="rId16">
               <w:r>
                 <w:rPr>
                   <w:color w:val="2A78D6"/>
@@ -6680,7 +6766,7 @@
         <w:t>1.</w:t>
         <w:tab/>
       </w:r>
-      <w:hyperlink r:id="rId12">
+      <w:hyperlink r:id="rId13">
         <w:r>
           <w:rPr>
             <w:color w:val="2A78D6"/>
@@ -6707,7 +6793,7 @@
         <w:t>2.</w:t>
         <w:tab/>
       </w:r>
-      <w:hyperlink r:id="rId13">
+      <w:hyperlink r:id="rId14">
         <w:r>
           <w:rPr>
             <w:color w:val="2A78D6"/>
@@ -6734,7 +6820,7 @@
         <w:t>3.</w:t>
         <w:tab/>
       </w:r>
-      <w:hyperlink r:id="rId12">
+      <w:hyperlink r:id="rId13">
         <w:r>
           <w:rPr>
             <w:color w:val="2A78D6"/>
@@ -6761,7 +6847,7 @@
         <w:t>4.</w:t>
         <w:tab/>
       </w:r>
-      <w:hyperlink r:id="rId14">
+      <w:hyperlink r:id="rId15">
         <w:r>
           <w:rPr>
             <w:color w:val="2A78D6"/>
@@ -6788,7 +6874,7 @@
         <w:t>5.</w:t>
         <w:tab/>
       </w:r>
-      <w:hyperlink r:id="rId15">
+      <w:hyperlink r:id="rId16">
         <w:r>
           <w:rPr>
             <w:color w:val="2A78D6"/>
@@ -6815,7 +6901,7 @@
         <w:t>6.</w:t>
         <w:tab/>
       </w:r>
-      <w:hyperlink r:id="rId16">
+      <w:hyperlink r:id="rId17">
         <w:r>
           <w:rPr>
             <w:color w:val="2A78D6"/>
@@ -6842,7 +6928,7 @@
         <w:t>7.</w:t>
         <w:tab/>
       </w:r>
-      <w:hyperlink r:id="rId17">
+      <w:hyperlink r:id="rId18">
         <w:r>
           <w:rPr>
             <w:color w:val="2A78D6"/>
@@ -6869,7 +6955,7 @@
         <w:t>8.</w:t>
         <w:tab/>
       </w:r>
-      <w:hyperlink r:id="rId18">
+      <w:hyperlink r:id="rId19">
         <w:r>
           <w:rPr>
             <w:color w:val="2A78D6"/>
@@ -6896,7 +6982,7 @@
         <w:t>9.</w:t>
         <w:tab/>
       </w:r>
-      <w:hyperlink r:id="rId19">
+      <w:hyperlink r:id="rId20">
         <w:r>
           <w:rPr>
             <w:color w:val="2A78D6"/>
@@ -6923,7 +7009,7 @@
         <w:t>10.</w:t>
         <w:tab/>
       </w:r>
-      <w:hyperlink r:id="rId20">
+      <w:hyperlink r:id="rId21">
         <w:r>
           <w:rPr>
             <w:color w:val="2A78D6"/>
@@ -6950,7 +7036,7 @@
         <w:t>11.</w:t>
         <w:tab/>
       </w:r>
-      <w:hyperlink r:id="rId21">
+      <w:hyperlink r:id="rId22">
         <w:r>
           <w:rPr>
             <w:color w:val="2A78D6"/>
@@ -6977,7 +7063,7 @@
         <w:t>12.</w:t>
         <w:tab/>
       </w:r>
-      <w:hyperlink r:id="rId23">
+      <w:hyperlink r:id="rId24">
         <w:r>
           <w:rPr>
             <w:color w:val="2A78D6"/>
@@ -7004,7 +7090,7 @@
         <w:t>13.</w:t>
         <w:tab/>
       </w:r>
-      <w:hyperlink r:id="rId21">
+      <w:hyperlink r:id="rId22">
         <w:r>
           <w:rPr>
             <w:color w:val="2A78D6"/>
@@ -7031,7 +7117,7 @@
         <w:t>14.</w:t>
         <w:tab/>
       </w:r>
-      <w:hyperlink r:id="rId24">
+      <w:hyperlink r:id="rId25">
         <w:r>
           <w:rPr>
             <w:color w:val="2A78D6"/>
@@ -7058,7 +7144,7 @@
         <w:t>15.</w:t>
         <w:tab/>
       </w:r>
-      <w:hyperlink r:id="rId25">
+      <w:hyperlink r:id="rId26">
         <w:r>
           <w:rPr>
             <w:color w:val="2A78D6"/>
@@ -7085,7 +7171,7 @@
         <w:t>16.</w:t>
         <w:tab/>
       </w:r>
-      <w:hyperlink r:id="rId26">
+      <w:hyperlink r:id="rId27">
         <w:r>
           <w:rPr>
             <w:color w:val="2A78D6"/>
@@ -7112,7 +7198,7 @@
         <w:t>17.</w:t>
         <w:tab/>
       </w:r>
-      <w:hyperlink r:id="rId16">
+      <w:hyperlink r:id="rId17">
         <w:r>
           <w:rPr>
             <w:color w:val="2A78D6"/>
@@ -7139,7 +7225,7 @@
         <w:t>18.</w:t>
         <w:tab/>
       </w:r>
-      <w:hyperlink r:id="rId27">
+      <w:hyperlink r:id="rId28">
         <w:r>
           <w:rPr>
             <w:color w:val="2A78D6"/>
@@ -7166,7 +7252,7 @@
         <w:t>19.</w:t>
         <w:tab/>
       </w:r>
-      <w:hyperlink r:id="rId28">
+      <w:hyperlink r:id="rId29">
         <w:r>
           <w:rPr>
             <w:color w:val="2A78D6"/>
@@ -7193,7 +7279,7 @@
         <w:t>20.</w:t>
         <w:tab/>
       </w:r>
-      <w:hyperlink r:id="rId30">
+      <w:hyperlink r:id="rId31">
         <w:r>
           <w:rPr>
             <w:color w:val="2A78D6"/>

</xml_diff>